<commit_message>
Minor fixing on project's docs
</commit_message>
<xml_diff>
--- a/documents/tesina.docx
+++ b/documents/tesina.docx
@@ -863,7 +863,37 @@
         <w:rPr>
           <w:color w:val="0D2B2B"/>
         </w:rPr>
-        <w:t xml:space="preserve">In DiceRoll, Electron serve principalmente per un motivo: permettere all'utente finale di avviare l'applicazione con un doppio clic sull'eseguibile .exe, senza dover installare Node.js, aprire un terminale o configurare un server locale. Il packaging </w:t>
+        <w:t xml:space="preserve">In DiceRoll, Electron serve principalmente per un motivo: permettere all'utente finale di avviare l'applicazione con un doppio clic sull'eseguibile </w:t>
+      </w:r>
+      <w:r>
+        <w:rPr>
+          <w:color w:val="0D2B2B"/>
+        </w:rPr>
+        <w:t>(dice</w:t>
+      </w:r>
+      <w:r>
+        <w:rPr>
+          <w:color w:val="0D2B2B"/>
+        </w:rPr>
+        <w:t>-roll</w:t>
+      </w:r>
+      <w:r>
+        <w:rPr>
+          <w:color w:val="0D2B2B"/>
+        </w:rPr>
+        <w:t>.exe</w:t>
+      </w:r>
+      <w:r>
+        <w:rPr>
+          <w:color w:val="0D2B2B"/>
+        </w:rPr>
+        <w:t>)</w:t>
+      </w:r>
+      <w:r>
+        <w:rPr>
+          <w:color w:val="0D2B2B"/>
+        </w:rPr>
+        <w:t xml:space="preserve">, senza dover installare Node.js, aprire un terminale o configurare un server locale. Il packaging </w:t>
       </w:r>
       <w:r>
         <w:rPr>
@@ -2009,7 +2039,13 @@
         <w:rPr>
           <w:color w:val="0D2B2B"/>
         </w:rPr>
-        <w:t xml:space="preserve">asyncio </w:t>
+        <w:t>A</w:t>
+      </w:r>
+      <w:r>
+        <w:rPr>
+          <w:color w:val="0D2B2B"/>
+        </w:rPr>
+        <w:t xml:space="preserve">syncio </w:t>
       </w:r>
       <w:r>
         <w:rPr>
@@ -2530,21 +2566,7 @@
         <w:rPr>
           <w:color w:val="0D2B2B"/>
         </w:rPr>
-        <w:t xml:space="preserve"> la sezione centrale di DiceRoll e replica fedelmente le meccaniche di D&amp;D 5e. Le sei caratteristiche principali (Forza, Destrezza, Costituzione, Intelligenza, Saggezza, Carisma) sono la base di tutti i calcoli: il modificatore di ogni caratteristica viene calcolato automaticamente con la formula standard </w:t>
-      </w:r>
-      <w:proofErr w:type="spellStart"/>
-      <w:r>
-        <w:rPr>
-          <w:color w:val="0D2B2B"/>
-        </w:rPr>
-        <w:t>floor</w:t>
-      </w:r>
-      <w:proofErr w:type="spellEnd"/>
-      <w:r>
-        <w:rPr>
-          <w:color w:val="0D2B2B"/>
-        </w:rPr>
-        <w:t>((valore - 10) / 2) e propagato a tutte le sezioni che ne dipendono — abilit</w:t>
+        <w:t xml:space="preserve"> la sezione centrale di DiceRoll e replica fedelmente le meccaniche di D&amp;D 5e. Le sei caratteristiche principali (Forza, Destrezza, Costituzione, Intelligenza, Saggezza, Carisma) sono la base di tutti i calcoli: il modificatore di ogni caratteristica viene calcolato automaticamente con la formula standard floor((valore - 10) / 2) e propagato a tutte le sezioni che ne dipendono — abilit</w:t>
       </w:r>
       <w:r>
         <w:rPr>

</xml_diff>

<commit_message>
Added images and fixed infos on the thesis
</commit_message>
<xml_diff>
--- a/documents/tesina.docx
+++ b/documents/tesina.docx
@@ -414,126 +414,46 @@
       <w:pPr>
         <w:spacing w:after="140"/>
         <w:jc w:val="both"/>
-      </w:pPr>
-      <w:r>
-        <w:rPr>
-          <w:color w:val="0D2B2B"/>
-        </w:rPr>
-        <w:t xml:space="preserve">DiceRoll </w:t>
-      </w:r>
-      <w:r>
-        <w:rPr>
-          <w:color w:val="0D2B2B"/>
-        </w:rPr>
-        <w:t>è</w:t>
-      </w:r>
-      <w:r>
-        <w:rPr>
-          <w:color w:val="0D2B2B"/>
-        </w:rPr>
-        <w:t xml:space="preserve"> un'applicazione web desktop-only sviluppata per digitalizzare e arricchire l'esperienza di gioco di Dungeons &amp; Dragons </w:t>
-      </w:r>
-      <w:r>
-        <w:rPr>
-          <w:color w:val="0D2B2B"/>
-        </w:rPr>
-        <w:t>5ª</w:t>
-      </w:r>
-      <w:r>
-        <w:rPr>
-          <w:color w:val="0D2B2B"/>
-        </w:rPr>
-        <w:t xml:space="preserve"> Edizione. Il progetto nasce da un'esigenza concreta: avere a disposizione, durante le sessioni di gioco, uno strumento interattivo e completo che sostituisca la classica scheda cartacea, eliminando i problemi legati a calcoli manuali, spazio fisico e difficolt</w:t>
-      </w:r>
-      <w:r>
-        <w:rPr>
-          <w:color w:val="0D2B2B"/>
-        </w:rPr>
-        <w:t>à</w:t>
-      </w:r>
-      <w:r>
-        <w:rPr>
-          <w:color w:val="0D2B2B"/>
-        </w:rPr>
-        <w:t xml:space="preserve"> di lettura.</w:t>
+        <w:rPr>
+          <w:color w:val="0D2B2B"/>
+        </w:rPr>
+      </w:pPr>
+      <w:r>
+        <w:rPr>
+          <w:color w:val="0D2B2B"/>
+        </w:rPr>
+        <w:t>DiceRoll è un'applicazione web desktop-only sviluppata per digitalizzare e arricchire l'esperienza di gioco di Dungeons &amp; Dragons 5ª Edizione. Il progetto nasce da un'esigenza concreta: avere a disposizione, durante le sessioni di gioco, uno strumento interattivo e completo che sostituisca la classica scheda cartacea, eliminando i problemi legati a calcoli manuali, spazio fisico e difficoltà di lettura.</w:t>
       </w:r>
     </w:p>
     <w:p>
       <w:pPr>
         <w:spacing w:after="140"/>
         <w:jc w:val="both"/>
-      </w:pPr>
-      <w:r>
-        <w:rPr>
-          <w:color w:val="0D2B2B"/>
-        </w:rPr>
-        <w:t xml:space="preserve">L'idea di partenza era semplice — una scheda digitale — ma il progetto si </w:t>
-      </w:r>
-      <w:r>
-        <w:rPr>
-          <w:color w:val="0D2B2B"/>
-        </w:rPr>
-        <w:t>è</w:t>
-      </w:r>
-      <w:r>
-        <w:rPr>
-          <w:color w:val="0D2B2B"/>
-        </w:rPr>
-        <w:t xml:space="preserve"> progressivamente espanso per includere funzionalit</w:t>
-      </w:r>
-      <w:r>
-        <w:rPr>
-          <w:color w:val="0D2B2B"/>
-        </w:rPr>
-        <w:t>à</w:t>
-      </w:r>
-      <w:r>
-        <w:rPr>
-          <w:color w:val="0D2B2B"/>
-        </w:rPr>
-        <w:t xml:space="preserve"> avanzate: gestione degli incantesimi, caricamento di mappe custom con marcatori interattivi, un pannello dedicato al Dungeon Master, e infine un sistema di Party Chat in tempo reale che permette ai giocatori seduti alla stessa rete di comunicare e condividere informazioni direttamente nell'applicazione.</w:t>
+        <w:rPr>
+          <w:color w:val="0D2B2B"/>
+        </w:rPr>
+      </w:pPr>
+      <w:r>
+        <w:rPr>
+          <w:color w:val="0D2B2B"/>
+        </w:rPr>
+        <w:t>L'idea di partenza era semplice — una scheda digitale — ma il progetto si è presto espanso includendo funzionalità avanzate: caricamento di mappe custom con marcatori interattivi, un pannello dedicato al Dungeon Master, e infine un sistema di Party Chat in tempo reale che permette ai giocatori seduti alla stessa rete di comunicare e condividere informazioni direttamente nell'applicazione.</w:t>
       </w:r>
     </w:p>
     <w:p>
       <w:pPr>
         <w:spacing w:after="140"/>
         <w:jc w:val="both"/>
-      </w:pPr>
-      <w:r>
-        <w:rPr>
-          <w:color w:val="0D2B2B"/>
-        </w:rPr>
-        <w:t xml:space="preserve">Dal punto di vista tecnico, DiceRoll </w:t>
-      </w:r>
-      <w:r>
-        <w:rPr>
-          <w:color w:val="0D2B2B"/>
-        </w:rPr>
-        <w:t>è</w:t>
-      </w:r>
-      <w:r>
-        <w:rPr>
-          <w:color w:val="0D2B2B"/>
-        </w:rPr>
-        <w:t xml:space="preserve"> composta da un frontend statico in HTML, CSS e JavaScript, distribuito come applicazione desktop tramite Electron, e da un server in Python che gestisce la comunicazione in tempo reale tra i giocatori via WebSocket. L'intera applicazione </w:t>
-      </w:r>
-      <w:r>
-        <w:rPr>
-          <w:color w:val="0D2B2B"/>
-        </w:rPr>
-        <w:t>è</w:t>
-      </w:r>
-      <w:r>
-        <w:rPr>
-          <w:color w:val="0D2B2B"/>
-        </w:rPr>
-        <w:t xml:space="preserve"> open source e pensata per essere utilizzata senza installazioni complesse: basta avviare l'eseguibile.</w:t>
-      </w:r>
-    </w:p>
-    <w:p>
-      <w:pPr>
-        <w:spacing w:after="100"/>
-      </w:pPr>
+        <w:rPr>
+          <w:color w:val="0D2B2B"/>
+        </w:rPr>
+      </w:pPr>
+      <w:r>
+        <w:rPr>
+          <w:color w:val="0D2B2B"/>
+        </w:rPr>
+        <w:t>Dal punto di vista tecnico, DiceRoll è composta da un frontend statico in HTML, CSS e JavaScript, distribuito come applicazione desktop tramite Electron, e da un server in Python che gestisce la comunicazione in tempo reale tra i giocatori via WebSocket. L'intera applicazione è open source e pensata per essere utilizzata senza installazioni complesse: basta avviare l'eseguibile.</w:t>
+      </w:r>
     </w:p>
     <w:p>
       <w:pPr>
@@ -597,6 +517,12 @@
         </w:rPr>
         <w:t>l'applicazione deve essere immediata da usare anche per chi non ha dimestichezza con strumenti digitali complessi. La scheda deve essere navigabile a tab, con calcoli automatici e feedback visivo chiaro</w:t>
       </w:r>
+      <w:r>
+        <w:rPr>
+          <w:color w:val="0D2B2B"/>
+        </w:rPr>
+        <w:t>;</w:t>
+      </w:r>
     </w:p>
     <w:p>
       <w:pPr>
@@ -657,6 +583,12 @@
         </w:rPr>
         <w:t xml:space="preserve"> dell'interfaccia</w:t>
       </w:r>
+      <w:r>
+        <w:rPr>
+          <w:color w:val="0D2B2B"/>
+        </w:rPr>
+        <w:t>;</w:t>
+      </w:r>
     </w:p>
     <w:p>
       <w:pPr>
@@ -709,13 +641,55 @@
         </w:rPr>
         <w:t xml:space="preserve"> opzionale)</w:t>
       </w:r>
-    </w:p>
-    <w:p>
-      <w:pPr>
-        <w:spacing w:after="100"/>
-      </w:pPr>
-    </w:p>
-    <w:p>
+      <w:r>
+        <w:rPr>
+          <w:color w:val="0D2B2B"/>
+        </w:rPr>
+        <w:t>.</w:t>
+      </w:r>
+    </w:p>
+    <w:p/>
+    <w:p>
+      <w:r>
+        <w:drawing>
+          <wp:inline distT="0" distB="0" distL="0" distR="0" wp14:anchorId="683B6280" wp14:editId="71ADC579">
+            <wp:extent cx="5566410" cy="3129915"/>
+            <wp:effectExtent l="0" t="0" r="0" b="0"/>
+            <wp:docPr id="983093414" name="Immagine 1"/>
+            <wp:cNvGraphicFramePr>
+              <a:graphicFrameLocks xmlns:a="http://schemas.openxmlformats.org/drawingml/2006/main" noChangeAspect="1"/>
+            </wp:cNvGraphicFramePr>
+            <a:graphic xmlns:a="http://schemas.openxmlformats.org/drawingml/2006/main">
+              <a:graphicData uri="http://schemas.openxmlformats.org/drawingml/2006/picture">
+                <pic:pic xmlns:pic="http://schemas.openxmlformats.org/drawingml/2006/picture">
+                  <pic:nvPicPr>
+                    <pic:cNvPr id="983093414" name=""/>
+                    <pic:cNvPicPr/>
+                  </pic:nvPicPr>
+                  <pic:blipFill>
+                    <a:blip r:embed="rId7"/>
+                    <a:stretch>
+                      <a:fillRect/>
+                    </a:stretch>
+                  </pic:blipFill>
+                  <pic:spPr>
+                    <a:xfrm>
+                      <a:off x="0" y="0"/>
+                      <a:ext cx="5566410" cy="3129915"/>
+                    </a:xfrm>
+                    <a:prstGeom prst="rect">
+                      <a:avLst/>
+                    </a:prstGeom>
+                  </pic:spPr>
+                </pic:pic>
+              </a:graphicData>
+            </a:graphic>
+          </wp:inline>
+        </w:drawing>
+      </w:r>
+      <w:r>
+        <w:t xml:space="preserve"> </w:t>
+      </w:r>
       <w:r>
         <w:br w:type="page"/>
       </w:r>
@@ -1002,11 +976,6 @@
     </w:p>
     <w:p>
       <w:pPr>
-        <w:spacing w:after="100"/>
-      </w:pPr>
-    </w:p>
-    <w:p>
-      <w:pPr>
         <w:pStyle w:val="Titolo2"/>
       </w:pPr>
       <w:r>
@@ -1097,26 +1066,26 @@
         <w:rPr>
           <w:color w:val="0D2B2B"/>
         </w:rPr>
-        <w:t xml:space="preserve"> il framework CSS scelto per velocizzare lo sviluppo. Fornisce il sistema di griglia responsive, i componenti preconfezionati come le modali, i badge, le card e le </w:t>
+        <w:t xml:space="preserve"> il framework CSS scelto per velocizzare lo sviluppo. Fornisce il sistema di griglia responsive, i componenti preconfezionati come le modali, i badge, le card e le navbar, oltre a una serie di classi di utilit</w:t>
+      </w:r>
+      <w:r>
+        <w:rPr>
+          <w:color w:val="0D2B2B"/>
+        </w:rPr>
+        <w:t>à</w:t>
+      </w:r>
+      <w:r>
+        <w:rPr>
+          <w:color w:val="0D2B2B"/>
+        </w:rPr>
+        <w:t xml:space="preserve"> per gestire margini, padding, display e colori. </w:t>
       </w:r>
       <w:r>
         <w:rPr>
           <w:color w:val="0D2B2B"/>
         </w:rPr>
         <w:lastRenderedPageBreak/>
-        <w:t>navbar, oltre a una serie di classi di utilit</w:t>
-      </w:r>
-      <w:r>
-        <w:rPr>
-          <w:color w:val="0D2B2B"/>
-        </w:rPr>
-        <w:t>à</w:t>
-      </w:r>
-      <w:r>
-        <w:rPr>
-          <w:color w:val="0D2B2B"/>
-        </w:rPr>
-        <w:t xml:space="preserve"> per gestire margini, padding, display e colori. L'utilizzo di Bootstrap ha permesso di concentrare lo sviluppo sulla logica applicativa, delegando al framework la coerenza visiva di base.</w:t>
+        <w:t>L'utilizzo di Bootstrap ha permesso di concentrare lo sviluppo sulla logica applicativa, delegando al framework la coerenza visiva di base.</w:t>
       </w:r>
     </w:p>
     <w:p>
@@ -1194,11 +1163,6 @@
         </w:rPr>
         <w:t xml:space="preserve"> una scelta che rende l’interfaccia facilmente personalizzabile: basta modificare poche variabili per cambiare l’aspetto dell’intera applicazione.</w:t>
       </w:r>
-    </w:p>
-    <w:p>
-      <w:pPr>
-        <w:spacing w:after="100"/>
-      </w:pPr>
     </w:p>
     <w:p>
       <w:pPr>
@@ -1420,7 +1384,7 @@
         <w:rPr>
           <w:color w:val="0D2B2B"/>
         </w:rPr>
-        <w:t>;</w:t>
+        <w:t>.</w:t>
       </w:r>
     </w:p>
     <w:p>
@@ -1469,11 +1433,6 @@
     </w:p>
     <w:p>
       <w:pPr>
-        <w:spacing w:after="100"/>
-      </w:pPr>
-    </w:p>
-    <w:p>
-      <w:pPr>
         <w:pStyle w:val="Titolo2"/>
       </w:pPr>
       <w:r>
@@ -1540,14 +1499,43 @@
         <w:rPr>
           <w:color w:val="0D2B2B"/>
         </w:rPr>
-        <w:t xml:space="preserve"> che i salvataggi successivi sovrascrivano direttamente lo stesso file senza richiedere ogni volta la scelta della </w:t>
-      </w:r>
-      <w:r>
-        <w:rPr>
-          <w:color w:val="0D2B2B"/>
-        </w:rPr>
-        <w:lastRenderedPageBreak/>
-        <w:t>destinazione. I dati vengono serializzati in formato JSON strutturato, che include tutte le informazioni della scheda, le impostazioni e un timestamp.</w:t>
+        <w:t xml:space="preserve"> che i salvataggi successivi sovrascrivano direttamente lo stesso file senza richiedere ogni volta la scelta della destinazione. I dati vengono serializzati in formato JSON strutturato, che include tutte le informazioni della scheda</w:t>
+      </w:r>
+      <w:r>
+        <w:rPr>
+          <w:color w:val="0D2B2B"/>
+        </w:rPr>
+        <w:t xml:space="preserve"> e</w:t>
+      </w:r>
+      <w:r>
+        <w:rPr>
+          <w:color w:val="0D2B2B"/>
+        </w:rPr>
+        <w:t xml:space="preserve"> le</w:t>
+      </w:r>
+      <w:r>
+        <w:rPr>
+          <w:color w:val="0D2B2B"/>
+        </w:rPr>
+        <w:t xml:space="preserve"> relative</w:t>
+      </w:r>
+      <w:r>
+        <w:rPr>
+          <w:color w:val="0D2B2B"/>
+        </w:rPr>
+        <w:t xml:space="preserve"> impostazion</w:t>
+      </w:r>
+      <w:r>
+        <w:rPr>
+          <w:color w:val="0D2B2B"/>
+        </w:rPr>
+        <w:t>i</w:t>
+      </w:r>
+      <w:r>
+        <w:rPr>
+          <w:color w:val="0D2B2B"/>
+        </w:rPr>
+        <w:t>.</w:t>
       </w:r>
     </w:p>
     <w:p>
@@ -1583,7 +1571,19 @@
         <w:rPr>
           <w:color w:val="0D2B2B"/>
         </w:rPr>
-        <w:t xml:space="preserve">salvataggio automatico su localStorage, che scatta ogni 60 secondi. </w:t>
+        <w:t xml:space="preserve">salvataggio automatico su localStorage, che </w:t>
+      </w:r>
+      <w:r>
+        <w:rPr>
+          <w:color w:val="0D2B2B"/>
+        </w:rPr>
+        <w:t>avviene</w:t>
+      </w:r>
+      <w:r>
+        <w:rPr>
+          <w:color w:val="0D2B2B"/>
+        </w:rPr>
+        <w:t xml:space="preserve"> ogni 60 secondi. </w:t>
       </w:r>
       <w:r>
         <w:rPr>
@@ -1595,7 +1595,14 @@
         <w:rPr>
           <w:color w:val="0D2B2B"/>
         </w:rPr>
-        <w:t xml:space="preserve"> un meccanismo di protezione contro chiusure accidentali dell'applicazione: se la scheda viene chiusa senza salvare, al successivo avvio l'applicazione rileva il backup e propone all'utente di ripristinarlo tramite una modale dedicata. Il backup viene ignorato se non contiene dati significativi, evitando prompt inutili all'apertura dell'applicazione.</w:t>
+        <w:t xml:space="preserve"> un meccanismo di protezione contro chiusure accidentali dell'applicazione: se la scheda viene chiusa senza salvare, al successivo avvio l'applicazione rileva il backup e </w:t>
+      </w:r>
+      <w:r>
+        <w:rPr>
+          <w:color w:val="0D2B2B"/>
+        </w:rPr>
+        <w:lastRenderedPageBreak/>
+        <w:t>propone all'utente di ripristinarlo tramite una modale dedicata. Il backup viene ignorato se non contiene dati significativi, evitando prompt inutili all'apertura dell'applicazione.</w:t>
       </w:r>
     </w:p>
     <w:p>
@@ -1678,6 +1685,43 @@
       <w:pPr>
         <w:spacing w:after="100"/>
       </w:pPr>
+      <w:r>
+        <w:drawing>
+          <wp:inline distT="0" distB="0" distL="0" distR="0" wp14:anchorId="2DEF97BC" wp14:editId="4DB0E285">
+            <wp:extent cx="5566410" cy="3129915"/>
+            <wp:effectExtent l="0" t="0" r="0" b="0"/>
+            <wp:docPr id="1925109205" name="Immagine 1"/>
+            <wp:cNvGraphicFramePr>
+              <a:graphicFrameLocks xmlns:a="http://schemas.openxmlformats.org/drawingml/2006/main" noChangeAspect="1"/>
+            </wp:cNvGraphicFramePr>
+            <a:graphic xmlns:a="http://schemas.openxmlformats.org/drawingml/2006/main">
+              <a:graphicData uri="http://schemas.openxmlformats.org/drawingml/2006/picture">
+                <pic:pic xmlns:pic="http://schemas.openxmlformats.org/drawingml/2006/picture">
+                  <pic:nvPicPr>
+                    <pic:cNvPr id="1925109205" name=""/>
+                    <pic:cNvPicPr/>
+                  </pic:nvPicPr>
+                  <pic:blipFill>
+                    <a:blip r:embed="rId8"/>
+                    <a:stretch>
+                      <a:fillRect/>
+                    </a:stretch>
+                  </pic:blipFill>
+                  <pic:spPr>
+                    <a:xfrm>
+                      <a:off x="0" y="0"/>
+                      <a:ext cx="5566410" cy="3129915"/>
+                    </a:xfrm>
+                    <a:prstGeom prst="rect">
+                      <a:avLst/>
+                    </a:prstGeom>
+                  </pic:spPr>
+                </pic:pic>
+              </a:graphicData>
+            </a:graphic>
+          </wp:inline>
+        </w:drawing>
+      </w:r>
     </w:p>
     <w:p>
       <w:pPr>
@@ -2158,11 +2202,6 @@
     </w:p>
     <w:p>
       <w:pPr>
-        <w:spacing w:after="100"/>
-      </w:pPr>
-    </w:p>
-    <w:p>
-      <w:pPr>
         <w:pStyle w:val="Titolo2"/>
       </w:pPr>
       <w:r>
@@ -2305,8 +2344,14 @@
         <w:rPr>
           <w:color w:val="0D2B2B"/>
         </w:rPr>
+        <w:t xml:space="preserve">In DiceRoll, tutti i messaggi scambiati tra client e server sono oggetti JSON. Il campo type indica il tipo di operazione, e il payload varia di conseguenza. I tipi gestiti sono: create (crea </w:t>
+      </w:r>
+      <w:r>
+        <w:rPr>
+          <w:color w:val="0D2B2B"/>
+        </w:rPr>
         <w:lastRenderedPageBreak/>
-        <w:t xml:space="preserve">In DiceRoll, tutti i messaggi scambiati tra client e server sono oggetti JSON. Il campo type indica il tipo di operazione, e il payload varia di conseguenza. I tipi gestiti sono: create (crea una nuova stanza protetta da password), join (accede a una stanza esistente), message (distribuisce un messaggio — testo o immagine codificata in base64 — a tutti i partecipanti), leave (abbandona la stanza) e ping/pong (heartbeat automatico </w:t>
+        <w:t xml:space="preserve">una nuova stanza protetta da password), join (accede a una stanza esistente), message (distribuisce un messaggio — testo o immagine codificata in base64 — a tutti i partecipanti), leave (abbandona la stanza) e ping/pong (heartbeat automatico </w:t>
       </w:r>
       <w:r>
         <w:rPr>
@@ -2332,11 +2377,6 @@
         </w:rPr>
         <w:t xml:space="preserve"> la connessione).</w:t>
       </w:r>
-    </w:p>
-    <w:p>
-      <w:pPr>
-        <w:spacing w:after="100"/>
-      </w:pPr>
     </w:p>
     <w:p>
       <w:pPr>
@@ -2477,6 +2517,43 @@
       <w:pPr>
         <w:spacing w:after="100"/>
       </w:pPr>
+      <w:r>
+        <w:drawing>
+          <wp:inline distT="0" distB="0" distL="0" distR="0" wp14:anchorId="397D8B08" wp14:editId="6F8092A5">
+            <wp:extent cx="5566410" cy="3129915"/>
+            <wp:effectExtent l="0" t="0" r="0" b="0"/>
+            <wp:docPr id="2111230921" name="Immagine 1"/>
+            <wp:cNvGraphicFramePr>
+              <a:graphicFrameLocks xmlns:a="http://schemas.openxmlformats.org/drawingml/2006/main" noChangeAspect="1"/>
+            </wp:cNvGraphicFramePr>
+            <a:graphic xmlns:a="http://schemas.openxmlformats.org/drawingml/2006/main">
+              <a:graphicData uri="http://schemas.openxmlformats.org/drawingml/2006/picture">
+                <pic:pic xmlns:pic="http://schemas.openxmlformats.org/drawingml/2006/picture">
+                  <pic:nvPicPr>
+                    <pic:cNvPr id="2111230921" name=""/>
+                    <pic:cNvPicPr/>
+                  </pic:nvPicPr>
+                  <pic:blipFill>
+                    <a:blip r:embed="rId9"/>
+                    <a:stretch>
+                      <a:fillRect/>
+                    </a:stretch>
+                  </pic:blipFill>
+                  <pic:spPr>
+                    <a:xfrm>
+                      <a:off x="0" y="0"/>
+                      <a:ext cx="5566410" cy="3129915"/>
+                    </a:xfrm>
+                    <a:prstGeom prst="rect">
+                      <a:avLst/>
+                    </a:prstGeom>
+                  </pic:spPr>
+                </pic:pic>
+              </a:graphicData>
+            </a:graphic>
+          </wp:inline>
+        </w:drawing>
+      </w:r>
     </w:p>
     <w:p>
       <w:r>
@@ -2655,11 +2732,6 @@
     </w:p>
     <w:p>
       <w:pPr>
-        <w:spacing w:after="100"/>
-      </w:pPr>
-    </w:p>
-    <w:p>
-      <w:pPr>
         <w:pStyle w:val="Titolo2"/>
       </w:pPr>
       <w:r>
@@ -2827,11 +2899,6 @@
     </w:p>
     <w:p>
       <w:pPr>
-        <w:spacing w:after="100"/>
-      </w:pPr>
-    </w:p>
-    <w:p>
-      <w:pPr>
         <w:pStyle w:val="Titolo2"/>
       </w:pPr>
       <w:r>
@@ -2898,23 +2965,18 @@
         <w:rPr>
           <w:color w:val="0D2B2B"/>
         </w:rPr>
+        <w:t>La galleria immagini permette al DM di caricare illustrazioni di mostri, scene di battaglia o ambientazioni da mostrare ai giocatori al momento opportuno. Gli appunti riservati al DM sono separati da quelli del giocatore e non vengono mostrati nelle sezioni pubbliche.</w:t>
+      </w:r>
+    </w:p>
+    <w:p>
+      <w:pPr>
+        <w:pStyle w:val="Titolo2"/>
+      </w:pPr>
+      <w:r>
+        <w:rPr>
+          <w:color w:val="0E9E82"/>
+        </w:rPr>
         <w:lastRenderedPageBreak/>
-        <w:t>La galleria immagini permette al DM di caricare illustrazioni di mostri, scene di battaglia o ambientazioni da mostrare ai giocatori al momento opportuno. Gli appunti riservati al DM sono separati da quelli del giocatore e non vengono mostrati nelle sezioni pubbliche.</w:t>
-      </w:r>
-    </w:p>
-    <w:p>
-      <w:pPr>
-        <w:spacing w:after="100"/>
-      </w:pPr>
-    </w:p>
-    <w:p>
-      <w:pPr>
-        <w:pStyle w:val="Titolo2"/>
-      </w:pPr>
-      <w:r>
-        <w:rPr>
-          <w:color w:val="0E9E82"/>
-        </w:rPr>
         <w:t>4.4 Party Chat</w:t>
       </w:r>
     </w:p>
@@ -3006,8 +3068,82 @@
       <w:pPr>
         <w:spacing w:after="100"/>
       </w:pPr>
-    </w:p>
-    <w:p>
+      <w:r>
+        <w:drawing>
+          <wp:inline distT="0" distB="0" distL="0" distR="0" wp14:anchorId="79DFB6FA" wp14:editId="6C76FF03">
+            <wp:extent cx="5566410" cy="3129915"/>
+            <wp:effectExtent l="0" t="0" r="0" b="0"/>
+            <wp:docPr id="596416218" name="Immagine 1"/>
+            <wp:cNvGraphicFramePr>
+              <a:graphicFrameLocks xmlns:a="http://schemas.openxmlformats.org/drawingml/2006/main" noChangeAspect="1"/>
+            </wp:cNvGraphicFramePr>
+            <a:graphic xmlns:a="http://schemas.openxmlformats.org/drawingml/2006/main">
+              <a:graphicData uri="http://schemas.openxmlformats.org/drawingml/2006/picture">
+                <pic:pic xmlns:pic="http://schemas.openxmlformats.org/drawingml/2006/picture">
+                  <pic:nvPicPr>
+                    <pic:cNvPr id="596416218" name=""/>
+                    <pic:cNvPicPr/>
+                  </pic:nvPicPr>
+                  <pic:blipFill>
+                    <a:blip r:embed="rId10"/>
+                    <a:stretch>
+                      <a:fillRect/>
+                    </a:stretch>
+                  </pic:blipFill>
+                  <pic:spPr>
+                    <a:xfrm>
+                      <a:off x="0" y="0"/>
+                      <a:ext cx="5566410" cy="3129915"/>
+                    </a:xfrm>
+                    <a:prstGeom prst="rect">
+                      <a:avLst/>
+                    </a:prstGeom>
+                  </pic:spPr>
+                </pic:pic>
+              </a:graphicData>
+            </a:graphic>
+          </wp:inline>
+        </w:drawing>
+      </w:r>
+    </w:p>
+    <w:p>
+      <w:r>
+        <w:drawing>
+          <wp:inline distT="0" distB="0" distL="0" distR="0" wp14:anchorId="5FA70E2F" wp14:editId="0C1DFCA1">
+            <wp:extent cx="5566410" cy="3129915"/>
+            <wp:effectExtent l="0" t="0" r="0" b="0"/>
+            <wp:docPr id="417031625" name="Immagine 1"/>
+            <wp:cNvGraphicFramePr>
+              <a:graphicFrameLocks xmlns:a="http://schemas.openxmlformats.org/drawingml/2006/main" noChangeAspect="1"/>
+            </wp:cNvGraphicFramePr>
+            <a:graphic xmlns:a="http://schemas.openxmlformats.org/drawingml/2006/main">
+              <a:graphicData uri="http://schemas.openxmlformats.org/drawingml/2006/picture">
+                <pic:pic xmlns:pic="http://schemas.openxmlformats.org/drawingml/2006/picture">
+                  <pic:nvPicPr>
+                    <pic:cNvPr id="417031625" name=""/>
+                    <pic:cNvPicPr/>
+                  </pic:nvPicPr>
+                  <pic:blipFill>
+                    <a:blip r:embed="rId11"/>
+                    <a:stretch>
+                      <a:fillRect/>
+                    </a:stretch>
+                  </pic:blipFill>
+                  <pic:spPr>
+                    <a:xfrm>
+                      <a:off x="0" y="0"/>
+                      <a:ext cx="5566410" cy="3129915"/>
+                    </a:xfrm>
+                    <a:prstGeom prst="rect">
+                      <a:avLst/>
+                    </a:prstGeom>
+                  </pic:spPr>
+                </pic:pic>
+              </a:graphicData>
+            </a:graphic>
+          </wp:inline>
+        </w:drawing>
+      </w:r>
       <w:r>
         <w:br w:type="page"/>
       </w:r>
@@ -4513,8 +4649,8 @@
       </w:pPr>
     </w:p>
     <w:sectPr>
-      <w:headerReference w:type="default" r:id="rId7"/>
-      <w:footerReference w:type="default" r:id="rId8"/>
+      <w:headerReference w:type="default" r:id="rId12"/>
+      <w:footerReference w:type="default" r:id="rId13"/>
       <w:pgSz w:w="11906" w:h="16838"/>
       <w:pgMar w:top="1440" w:right="1440" w:bottom="1440" w:left="1700" w:header="708" w:footer="708" w:gutter="0"/>
       <w:cols w:space="720"/>
@@ -5337,7 +5473,6 @@
   <w:style w:type="character" w:default="1" w:styleId="Carpredefinitoparagrafo">
     <w:name w:val="Default Paragraph Font"/>
     <w:uiPriority w:val="1"/>
-    <w:semiHidden/>
     <w:unhideWhenUsed/>
   </w:style>
   <w:style w:type="table" w:default="1" w:styleId="Tabellanormale">

</xml_diff>

<commit_message>
Final version (at least for now) of the thesis
</commit_message>
<xml_diff>
--- a/documents/tesina.docx
+++ b/documents/tesina.docx
@@ -5,6 +5,8 @@
     <w:p>
       <w:pPr>
         <w:spacing w:after="80"/>
+      </w:pPr>
+      <w:r>
         <w:rPr>
           <w:b/>
           <w:bCs/>
@@ -12,20 +14,6 @@
           <w:sz w:val="24"/>
           <w:szCs w:val="24"/>
         </w:rPr>
-      </w:pPr>
-    </w:p>
-    <w:p>
-      <w:pPr>
-        <w:spacing w:after="80"/>
-      </w:pPr>
-      <w:r>
-        <w:rPr>
-          <w:b/>
-          <w:bCs/>
-          <w:color w:val="1A3A6B"/>
-          <w:sz w:val="24"/>
-          <w:szCs w:val="24"/>
-        </w:rPr>
         <w:t>Lisa Thomas</w:t>
       </w:r>
     </w:p>
@@ -410,6 +398,9 @@
     <w:p>
       <w:pPr>
         <w:spacing w:after="60"/>
+        <w:rPr>
+          <w:color w:val="0D2459"/>
+        </w:rPr>
       </w:pPr>
       <w:r>
         <w:rPr>
@@ -429,6 +420,20 @@
     <w:p>
       <w:pPr>
         <w:spacing w:after="60"/>
+        <w:rPr>
+          <w:color w:val="2E86DE"/>
+        </w:rPr>
+      </w:pPr>
+      <w:r>
+        <w:rPr>
+          <w:color w:val="2E86DE"/>
+        </w:rPr>
+        <w:t xml:space="preserve">      6.1 Motivazione dietro alle tecnologie utilizzate</w:t>
+      </w:r>
+    </w:p>
+    <w:p>
+      <w:pPr>
+        <w:spacing w:after="60"/>
       </w:pPr>
       <w:r>
         <w:rPr>
@@ -443,6 +448,17 @@
           <w:color w:val="0D2459"/>
         </w:rPr>
         <w:t>Conclusioni</w:t>
+      </w:r>
+    </w:p>
+    <w:p>
+      <w:pPr>
+        <w:spacing w:after="60"/>
+      </w:pPr>
+      <w:r>
+        <w:rPr>
+          <w:color w:val="2E86DE"/>
+        </w:rPr>
+        <w:t xml:space="preserve">      7.1 Possibili Sviluppi Futuri</w:t>
       </w:r>
       <w:r>
         <w:br w:type="page"/>
@@ -502,47 +518,94 @@
     </w:p>
     <w:p>
       <w:pPr>
-        <w:spacing w:after="140"/>
-        <w:jc w:val="both"/>
-        <w:rPr>
-          <w:color w:val="0D2459"/>
-        </w:rPr>
-      </w:pPr>
-      <w:r>
-        <w:rPr>
-          <w:color w:val="0D2459"/>
-        </w:rPr>
-        <w:t>DiceRoll è un'applicazione web desktop-only sviluppata per digitalizzare e arricchire l'esperienza di gioco di Dungeons &amp; Dragons 5ª Edizione. Il progetto nasce da un'esigenza concreta: avere a disposizione, durante le sessioni di gioco, uno strumento interattivo e completo che sostituisca la classica scheda cartacea, eliminando i problemi legati a calcoli manuali, spazio fisico e difficoltà di lettura.</w:t>
-      </w:r>
-    </w:p>
-    <w:p>
-      <w:pPr>
-        <w:spacing w:after="140"/>
-        <w:jc w:val="both"/>
-        <w:rPr>
-          <w:color w:val="0D2459"/>
-        </w:rPr>
-      </w:pPr>
-      <w:r>
-        <w:rPr>
-          <w:color w:val="0D2459"/>
-        </w:rPr>
-        <w:t>L'idea di partenza era semplice — una scheda digitale — ma il progetto si è presto espanso includendo funzionalità avanzate: caricamento di mappe custom con marcatori interattivi, un pannello dedicato al Dungeon Master, e infine un sistema di Party Chat in tempo reale che permette ai giocatori seduti alla stessa rete di comunicare e condividere informazioni direttamente nell'applicazione.</w:t>
-      </w:r>
-    </w:p>
-    <w:p>
-      <w:pPr>
-        <w:spacing w:after="140"/>
-        <w:jc w:val="both"/>
-        <w:rPr>
-          <w:color w:val="0D2459"/>
-        </w:rPr>
-      </w:pPr>
-      <w:r>
-        <w:rPr>
-          <w:color w:val="0D2459"/>
-        </w:rPr>
-        <w:t>Dal punto di vista tecnico, DiceRoll è composta da un frontend statico in HTML, CSS e JavaScript, distribuito come applicazione desktop tramite Electron, e da un server in Python che gestisce la comunicazione in tempo reale tra i giocatori via WebSocket. L'intera applicazione è open source e pensata per essere utilizzata senza installazioni complesse: basta avviare l'eseguibile.</w:t>
+        <w:pStyle w:val="Titolo2"/>
+        <w:jc w:val="both"/>
+        <w:rPr>
+          <w:b w:val="0"/>
+          <w:bCs w:val="0"/>
+          <w:color w:val="0D2459"/>
+          <w:sz w:val="22"/>
+          <w:szCs w:val="22"/>
+        </w:rPr>
+      </w:pPr>
+      <w:r>
+        <w:rPr>
+          <w:b w:val="0"/>
+          <w:bCs w:val="0"/>
+          <w:color w:val="0D2459"/>
+          <w:sz w:val="22"/>
+          <w:szCs w:val="22"/>
+        </w:rPr>
+        <w:t>DiceRoll è un'applicazione web desktop-only sviluppata per digitalizzare e arricchire l’esperienza di gioco di Dungeons &amp; Dragons 5ª Edizione. Il progetto nasce dall’esigenza di avere uno strumento interattivo che sostituisca la classica scheda cartacea, eliminando problemi legati a calcoli manuali, spazio fisico e leggibilità.</w:t>
+      </w:r>
+    </w:p>
+    <w:p>
+      <w:pPr>
+        <w:pStyle w:val="Titolo2"/>
+        <w:jc w:val="both"/>
+        <w:rPr>
+          <w:b w:val="0"/>
+          <w:bCs w:val="0"/>
+          <w:color w:val="0D2459"/>
+          <w:sz w:val="22"/>
+          <w:szCs w:val="22"/>
+        </w:rPr>
+      </w:pPr>
+      <w:r>
+        <w:rPr>
+          <w:b w:val="0"/>
+          <w:bCs w:val="0"/>
+          <w:color w:val="0D2459"/>
+          <w:sz w:val="22"/>
+          <w:szCs w:val="22"/>
+        </w:rPr>
+        <w:t>L’idea iniziale di una semplice scheda digitale si è evoluta rapidamente includendo funzionalità avanzate come il caricamento di mappe personalizzate con marcatori interattivi, un pannello dedicato al Dungeon Master e un sistema di Party Chat in tempo reale che consente ai giocatori sulla stessa rete di comunicare direttamente dall’applicazione.</w:t>
+      </w:r>
+    </w:p>
+    <w:p>
+      <w:pPr>
+        <w:pStyle w:val="Titolo2"/>
+        <w:jc w:val="both"/>
+        <w:rPr>
+          <w:b w:val="0"/>
+          <w:bCs w:val="0"/>
+          <w:color w:val="0D2459"/>
+          <w:sz w:val="22"/>
+          <w:szCs w:val="22"/>
+        </w:rPr>
+      </w:pPr>
+      <w:r>
+        <w:rPr>
+          <w:b w:val="0"/>
+          <w:bCs w:val="0"/>
+          <w:color w:val="0D2459"/>
+          <w:sz w:val="22"/>
+          <w:szCs w:val="22"/>
+        </w:rPr>
+        <w:t>Dal punto di vista tecnico, DiceRoll è composta da un frontend statico in HTML, CSS e JavaScript distribuito tramite Electron, e da un server Python che gestisce la comunicazione WebSocket tra i giocatori. L’applicazione è open source e progettata per essere utilizzata senza configurazioni complesse: è sufficiente avviare l’eseguibile.</w:t>
+      </w:r>
+    </w:p>
+    <w:p>
+      <w:pPr>
+        <w:pStyle w:val="Titolo2"/>
+        <w:jc w:val="both"/>
+        <w:rPr>
+          <w:b w:val="0"/>
+          <w:bCs w:val="0"/>
+          <w:color w:val="0D2459"/>
+          <w:sz w:val="22"/>
+          <w:szCs w:val="22"/>
+        </w:rPr>
+      </w:pPr>
+      <w:r>
+        <w:rPr>
+          <w:b w:val="0"/>
+          <w:bCs w:val="0"/>
+          <w:color w:val="0D2459"/>
+          <w:sz w:val="22"/>
+          <w:szCs w:val="22"/>
+        </w:rPr>
+        <w:t>Una delle principali scelte progettuali è stata quella di realizzare un’applicazione completamente offline. Il salvataggio delle schede avviene tramite la File System Access API direttamente sul filesystem locale, mentre il backup automatico viene conservato nel localStorage di Electron. Anche la Party Chat utilizza un server WebSocket eseguito sulla rete locale dell’utente, senza alcun transito di dati su Internet. Questo approccio garantisce privacy, indipendenza da servizi cloud e la possibilità di utilizzare DiceRoll in qualsiasi contesto.</w:t>
       </w:r>
     </w:p>
     <w:p>
@@ -576,6 +639,7 @@
           <w:numId w:val="2"/>
         </w:numPr>
         <w:spacing w:after="80"/>
+        <w:jc w:val="both"/>
       </w:pPr>
       <w:r>
         <w:rPr>
@@ -600,6 +664,7 @@
           <w:numId w:val="2"/>
         </w:numPr>
         <w:spacing w:after="80"/>
+        <w:jc w:val="both"/>
       </w:pPr>
       <w:r>
         <w:rPr>
@@ -624,6 +689,7 @@
           <w:numId w:val="2"/>
         </w:numPr>
         <w:spacing w:after="80"/>
+        <w:jc w:val="both"/>
       </w:pPr>
       <w:r>
         <w:rPr>
@@ -646,7 +712,6 @@
         <w:rPr>
           <w:noProof/>
         </w:rPr>
-        <w:lastRenderedPageBreak/>
         <w:drawing>
           <wp:inline distT="0" distB="0" distL="0" distR="0" wp14:anchorId="683B6280" wp14:editId="71ADC579">
             <wp:extent cx="5566410" cy="3129915"/>
@@ -852,8 +917,76 @@
           <w:iCs/>
           <w:color w:val="0099CC"/>
         </w:rPr>
-        <w:t>💡</w:t>
-      </w:r>
+        <w:t xml:space="preserve">💡 In breve: </w:t>
+      </w:r>
+      <w:r>
+        <w:rPr>
+          <w:i/>
+          <w:iCs/>
+          <w:color w:val="154E6B"/>
+        </w:rPr>
+        <w:t>In sostanza, Electron permette di usare tecnologie web per costruire un’applicazione desktop a tutti gli effetti. La scelta è motivata dalla necessità che l’applicazione fosse fruibile da chiunque senza configurazioni: il risultato è un file eseguibile autonomo. Il lato negativo è una dimensione del pacchetto maggiore rispetto a un’applicazione nativa, ma per il contesto d’uso previsto si tratta di un compromesso accettabile.</w:t>
+      </w:r>
+    </w:p>
+    <w:p>
+      <w:pPr>
+        <w:pStyle w:val="Titolo2"/>
+      </w:pPr>
+      <w:r>
+        <w:rPr>
+          <w:color w:val="0077FF"/>
+        </w:rPr>
+        <w:t>2.2 HTML5, CSS3 e Bootstrap</w:t>
+      </w:r>
+    </w:p>
+    <w:p>
+      <w:pPr>
+        <w:spacing w:after="140"/>
+        <w:jc w:val="both"/>
+      </w:pPr>
+      <w:r>
+        <w:rPr>
+          <w:color w:val="0D2459"/>
+        </w:rPr>
+        <w:t>HTML5 definisce l'intera struttura dell'interfaccia utente nel file index.html. L'architettura adottata è quella di una Single Page Application (SPA): tutto il markup viene caricato una sola volta al primo avvio, e la navigazione tra le diverse sezioni — Scheda, Equipaggiamento, Incantesimi, Mappe, Scaling, DM, Party — avviene esclusivamente tramite JavaScript, mostrando e nascondendo i pannelli corrispondenti senza mai ricaricare la pagina. Questo approccio garantisce una risposta immediata all'utente e un'esperienza fluida.</w:t>
+      </w:r>
+    </w:p>
+    <w:p>
+      <w:pPr>
+        <w:spacing w:after="140"/>
+        <w:jc w:val="both"/>
+      </w:pPr>
+      <w:r>
+        <w:rPr>
+          <w:color w:val="0D2459"/>
+        </w:rPr>
+        <w:t>CSS3, nel file style.css, gestisce il tema visivo dell'applicazione. Uno degli aspetti più curati è il sistema di temi chiaro e scuro (Day Mode / Night Mode): le variabili CSS custom (--bg-primary, --text-color, ecc.) permettono di cambiare l'aspetto dell'intera interfaccia modificando un solo attributo sul tag html, senza dover riscrivere le regole di stile. La preferenza dell'utente viene salvata automaticamente in localStorage e ripristinata all'avvio successivo.</w:t>
+      </w:r>
+    </w:p>
+    <w:p>
+      <w:pPr>
+        <w:spacing w:after="140"/>
+        <w:jc w:val="both"/>
+      </w:pPr>
+      <w:r>
+        <w:rPr>
+          <w:color w:val="0D2459"/>
+        </w:rPr>
+        <w:t xml:space="preserve">Bootstrap 5.3 è il framework CSS scelto per velocizzare lo sviluppo. Fornisce il sistema di griglia responsive, i componenti preconfezionati come le modali, i badge, le card e le navbar, oltre a una serie di classi di utilità per gestire margini, padding, display e colori. </w:t>
+      </w:r>
+      <w:r>
+        <w:rPr>
+          <w:color w:val="0D2459"/>
+        </w:rPr>
+        <w:lastRenderedPageBreak/>
+        <w:t>L'utilizzo di Bootstrap ha permesso di concentrare lo sviluppo sulla logica applicativa, delegando al framework la coerenza visiva di base.</w:t>
+      </w:r>
+    </w:p>
+    <w:p>
+      <w:pPr>
+        <w:spacing w:before="80" w:after="140"/>
+        <w:jc w:val="both"/>
+      </w:pPr>
       <w:r>
         <w:rPr>
           <w:b/>
@@ -862,101 +995,7 @@
           <w:iCs/>
           <w:color w:val="0099CC"/>
         </w:rPr>
-        <w:t xml:space="preserve"> In breve: </w:t>
-      </w:r>
-      <w:r>
-        <w:rPr>
-          <w:i/>
-          <w:iCs/>
-          <w:color w:val="154E6B"/>
-        </w:rPr>
-        <w:t>In sostanza, Electron permette di usare tecnologie web per costruire un’applicazione desktop a tutti gli effetti. La scelta è motivata dalla necessità che l’applicazione fosse fruibile da chiunque senza configurazioni: il risultato è un file eseguibile autonomo. Il lato negativo è una dimensione del pacchetto maggiore rispetto a un’applicazione nativa, ma per il contesto d’uso previsto si tratta di un compromesso accettabile.</w:t>
-      </w:r>
-    </w:p>
-    <w:p>
-      <w:pPr>
-        <w:pStyle w:val="Titolo2"/>
-      </w:pPr>
-      <w:r>
-        <w:rPr>
-          <w:color w:val="0077FF"/>
-        </w:rPr>
-        <w:t>2.2 HTML5, CSS3 e Bootstrap</w:t>
-      </w:r>
-    </w:p>
-    <w:p>
-      <w:pPr>
-        <w:spacing w:after="140"/>
-        <w:jc w:val="both"/>
-      </w:pPr>
-      <w:r>
-        <w:rPr>
-          <w:color w:val="0D2459"/>
-        </w:rPr>
-        <w:t>HTML5 definisce l'intera struttura dell'interfaccia utente nel file index.html. L'architettura adottata è quella di una Single Page Application (SPA): tutto il markup viene caricato una sola volta al primo avvio, e la navigazione tra le diverse sezioni — Scheda, Equipaggiamento, Incantesimi, Mappe, Scaling, DM, Party — avviene esclusivamente tramite JavaScript, mostrando e nascondendo i pannelli corrispondenti senza mai ricaricare la pagina. Questo approccio garantisce una risposta immediata all'utente e un</w:t>
-      </w:r>
-      <w:r>
-        <w:rPr>
-          <w:color w:val="0D2459"/>
-        </w:rPr>
-        <w:t>'esperienza fluida.</w:t>
-      </w:r>
-    </w:p>
-    <w:p>
-      <w:pPr>
-        <w:spacing w:after="140"/>
-        <w:jc w:val="both"/>
-      </w:pPr>
-      <w:r>
-        <w:rPr>
-          <w:color w:val="0D2459"/>
-        </w:rPr>
-        <w:t>CSS3, nel file style.css, gestisce il tema visivo dell'applicazione. Uno degli aspetti più curati è il sistema di temi chiaro e scuro (Day Mode / Night Mode): le variabili CSS custom (--bg-primary, --text-color, ecc.) permettono di cambiare l'aspetto dell'intera interfaccia modificando un solo attributo sul tag html, senza dover riscrivere le regole di stile. La preferenza dell'utente viene salvata automaticamente in localStorage e ripristinata all'avvio successivo.</w:t>
-      </w:r>
-    </w:p>
-    <w:p>
-      <w:pPr>
-        <w:spacing w:after="140"/>
-        <w:jc w:val="both"/>
-      </w:pPr>
-      <w:r>
-        <w:rPr>
-          <w:color w:val="0D2459"/>
-        </w:rPr>
-        <w:t xml:space="preserve">Bootstrap 5.3 è il framework CSS scelto per velocizzare lo sviluppo. Fornisce il sistema di griglia responsive, i componenti preconfezionati come le modali, i badge, le card e le navbar, oltre a una serie di classi di utilità per gestire margini, padding, display e colori. </w:t>
-      </w:r>
-      <w:r>
-        <w:rPr>
-          <w:color w:val="0D2459"/>
-        </w:rPr>
-        <w:lastRenderedPageBreak/>
-        <w:t>L'utilizzo di Bootstrap ha permesso di concentrare lo sviluppo sulla logica applicativa, delegando al framework la coerenza visiva di base.</w:t>
-      </w:r>
-    </w:p>
-    <w:p>
-      <w:pPr>
-        <w:spacing w:before="80" w:after="140"/>
-        <w:jc w:val="both"/>
-      </w:pPr>
-      <w:r>
-        <w:rPr>
-          <w:b/>
-          <w:bCs/>
-          <w:i/>
-          <w:iCs/>
-          <w:color w:val="0099CC"/>
-        </w:rPr>
-        <w:t>💡</w:t>
-      </w:r>
-      <w:r>
-        <w:rPr>
-          <w:b/>
-          <w:bCs/>
-          <w:i/>
-          <w:iCs/>
-          <w:color w:val="0099CC"/>
-        </w:rPr>
-        <w:t xml:space="preserve"> In breve: </w:t>
+        <w:t xml:space="preserve">💡 In breve: </w:t>
       </w:r>
       <w:r>
         <w:rPr>
@@ -1022,6 +1061,7 @@
           <w:numId w:val="2"/>
         </w:numPr>
         <w:spacing w:after="80"/>
+        <w:jc w:val="both"/>
       </w:pPr>
       <w:r>
         <w:rPr>
@@ -1038,6 +1078,7 @@
           <w:numId w:val="2"/>
         </w:numPr>
         <w:spacing w:after="80"/>
+        <w:jc w:val="both"/>
       </w:pPr>
       <w:r>
         <w:rPr>
@@ -1054,6 +1095,7 @@
           <w:numId w:val="2"/>
         </w:numPr>
         <w:spacing w:after="80"/>
+        <w:jc w:val="both"/>
       </w:pPr>
       <w:r>
         <w:rPr>
@@ -1070,6 +1112,7 @@
           <w:numId w:val="2"/>
         </w:numPr>
         <w:spacing w:after="80"/>
+        <w:jc w:val="both"/>
       </w:pPr>
       <w:r>
         <w:rPr>
@@ -1086,6 +1129,7 @@
           <w:numId w:val="2"/>
         </w:numPr>
         <w:spacing w:after="80"/>
+        <w:jc w:val="both"/>
       </w:pPr>
       <w:r>
         <w:rPr>
@@ -1107,8 +1151,76 @@
           <w:iCs/>
           <w:color w:val="0099CC"/>
         </w:rPr>
-        <w:t>💡</w:t>
-      </w:r>
+        <w:t xml:space="preserve">💡 In breve: </w:t>
+      </w:r>
+      <w:r>
+        <w:rPr>
+          <w:i/>
+          <w:iCs/>
+          <w:color w:val="154E6B"/>
+        </w:rPr>
+        <w:t>Non usare un framework reattivo ha richiesto più lavoro, ma ha avuto un valore formativo preciso: gestire manualmente l’aggiornamento dell’interfaccia e la sincronizzazione dei dati ha permesso di capire concretamente cosa fanno strumenti come React o Vue sotto la superficie, invece di usarli come scatole nere.</w:t>
+      </w:r>
+    </w:p>
+    <w:p>
+      <w:pPr>
+        <w:pStyle w:val="Titolo2"/>
+      </w:pPr>
+      <w:r>
+        <w:rPr>
+          <w:color w:val="0077FF"/>
+        </w:rPr>
+        <w:t>2.4 Salvataggio dei dati</w:t>
+      </w:r>
+    </w:p>
+    <w:p>
+      <w:pPr>
+        <w:spacing w:after="140"/>
+        <w:jc w:val="both"/>
+      </w:pPr>
+      <w:r>
+        <w:rPr>
+          <w:color w:val="0D2459"/>
+        </w:rPr>
+        <w:t>DiceRoll implementa due strategie di salvataggio complementari, che coprono scenari d'uso differenti.</w:t>
+      </w:r>
+    </w:p>
+    <w:p>
+      <w:pPr>
+        <w:spacing w:after="140"/>
+        <w:jc w:val="both"/>
+      </w:pPr>
+      <w:r>
+        <w:rPr>
+          <w:color w:val="0D2459"/>
+        </w:rPr>
+        <w:t>La prima è basata sulla File System Access API, un'API moderna dei browser (supportata anche in Electron) che permette di aprire, leggere e scrivere file direttamente nel filesystem dell'utente, in modo simile a come farebbe una normale applicazione desktop. Quando l'utente clicca 'Salva con nome’, viene aperto il selettore file nativo del sistema operativo; il riferimento al file scelto viene mantenuto in memoria, così che i salvataggi successivi sovrascrivano direttamente lo stesso file senza richiedere ogni volta la scelta della destinazione. I dati vengono serializzati in formato JSON strutturato, che include tutte le informazioni della scheda e le relative impostazioni.</w:t>
+      </w:r>
+    </w:p>
+    <w:p>
+      <w:pPr>
+        <w:spacing w:after="140"/>
+        <w:jc w:val="both"/>
+      </w:pPr>
+      <w:r>
+        <w:rPr>
+          <w:color w:val="0D2459"/>
+        </w:rPr>
+        <w:t xml:space="preserve">La seconda strategia è il salvataggio automatico su localStorage, che avviene ogni 60 secondi. È un meccanismo di protezione contro chiusure accidentali dell'applicazione: se la scheda viene chiusa senza salvare, al successivo avvio l'applicazione rileva il backup e </w:t>
+      </w:r>
+      <w:r>
+        <w:rPr>
+          <w:color w:val="0D2459"/>
+        </w:rPr>
+        <w:lastRenderedPageBreak/>
+        <w:t>propone all'utente di ripristinarlo tramite una modale dedicata. Il backup viene ignorato se non contiene dati significativi, evitando prompt inutili all'apertura dell'applicazione.</w:t>
+      </w:r>
+    </w:p>
+    <w:p>
+      <w:pPr>
+        <w:spacing w:before="80" w:after="140"/>
+        <w:jc w:val="both"/>
+      </w:pPr>
       <w:r>
         <w:rPr>
           <w:b/>
@@ -1117,101 +1229,7 @@
           <w:iCs/>
           <w:color w:val="0099CC"/>
         </w:rPr>
-        <w:t xml:space="preserve"> In breve: </w:t>
-      </w:r>
-      <w:r>
-        <w:rPr>
-          <w:i/>
-          <w:iCs/>
-          <w:color w:val="154E6B"/>
-        </w:rPr>
-        <w:t>Non usare un framework reattivo ha richiesto più lavoro, ma ha avuto un valore formativo preciso: gestire manualmente l’aggiornamento dell’interfaccia e la sincronizzazione dei dati ha permesso di capire concretamente cosa fanno strumenti come React o Vue sotto la superficie, invece di usarli come scatole nere.</w:t>
-      </w:r>
-    </w:p>
-    <w:p>
-      <w:pPr>
-        <w:pStyle w:val="Titolo2"/>
-      </w:pPr>
-      <w:r>
-        <w:rPr>
-          <w:color w:val="0077FF"/>
-        </w:rPr>
-        <w:t>2.4 Salvataggio dei dati</w:t>
-      </w:r>
-    </w:p>
-    <w:p>
-      <w:pPr>
-        <w:spacing w:after="140"/>
-        <w:jc w:val="both"/>
-      </w:pPr>
-      <w:r>
-        <w:rPr>
-          <w:color w:val="0D2459"/>
-        </w:rPr>
-        <w:t>DiceRoll implementa due strategie di salvataggio complementari, che coprono scenari d'uso differenti.</w:t>
-      </w:r>
-    </w:p>
-    <w:p>
-      <w:pPr>
-        <w:spacing w:after="140"/>
-        <w:jc w:val="both"/>
-      </w:pPr>
-      <w:r>
-        <w:rPr>
-          <w:color w:val="0D2459"/>
-        </w:rPr>
-        <w:t>La prima è basata sulla File System Access API, un'API moderna dei browser (supportata anche in Electron) che permette di aprire, leggere e scrivere file direttamente nel filesystem dell'utente, in modo simile a come farebbe una normale applicazione desktop. Quando l'utente clicca 'Salva con nome’, viene aperto il selettore file nativo del sistema operativo; il riferimento al file scelto viene mantenuto in memoria, così che i salvataggi successivi sovrascrivano direttamente lo stesso file senza richiedere o</w:t>
-      </w:r>
-      <w:r>
-        <w:rPr>
-          <w:color w:val="0D2459"/>
-        </w:rPr>
-        <w:t>gni volta la scelta della destinazione. I dati vengono serializzati in formato JSON strutturato, che include tutte le informazioni della scheda e le relative impostazioni.</w:t>
-      </w:r>
-    </w:p>
-    <w:p>
-      <w:pPr>
-        <w:spacing w:after="140"/>
-        <w:jc w:val="both"/>
-      </w:pPr>
-      <w:r>
-        <w:rPr>
-          <w:color w:val="0D2459"/>
-        </w:rPr>
-        <w:t xml:space="preserve">La seconda strategia è il salvataggio automatico su localStorage, che avviene ogni 60 secondi. È un meccanismo di protezione contro chiusure accidentali dell'applicazione: se la scheda viene chiusa senza salvare, al successivo avvio l'applicazione rileva il backup e </w:t>
-      </w:r>
-      <w:r>
-        <w:rPr>
-          <w:color w:val="0D2459"/>
-        </w:rPr>
-        <w:lastRenderedPageBreak/>
-        <w:t>propone all'utente di ripristinarlo tramite una modale dedicata. Il backup viene ignorato se non contiene dati significativi, evitando prompt inutili all'apertura dell'applicazione.</w:t>
-      </w:r>
-    </w:p>
-    <w:p>
-      <w:pPr>
-        <w:spacing w:before="80" w:after="140"/>
-        <w:jc w:val="both"/>
-      </w:pPr>
-      <w:r>
-        <w:rPr>
-          <w:b/>
-          <w:bCs/>
-          <w:i/>
-          <w:iCs/>
-          <w:color w:val="0099CC"/>
-        </w:rPr>
-        <w:t>💡</w:t>
-      </w:r>
-      <w:r>
-        <w:rPr>
-          <w:b/>
-          <w:bCs/>
-          <w:i/>
-          <w:iCs/>
-          <w:color w:val="0099CC"/>
-        </w:rPr>
-        <w:t xml:space="preserve"> In breve: </w:t>
+        <w:t xml:space="preserve">💡 In breve: </w:t>
       </w:r>
       <w:r>
         <w:rPr>
@@ -1331,8 +1349,106 @@
           <w:iCs/>
           <w:color w:val="0099CC"/>
         </w:rPr>
-        <w:t>💡</w:t>
-      </w:r>
+        <w:t xml:space="preserve">💡 In breve: </w:t>
+      </w:r>
+      <w:r>
+        <w:rPr>
+          <w:i/>
+          <w:iCs/>
+          <w:color w:val="154E6B"/>
+        </w:rPr>
+        <w:t>Il sistema di internazionalizzazione è stato sviluppato internamente seguendo lo stesso principio dei framework professionali: i testi sono separati dal codice dell’interfaccia e organizzati in file dizionario. Questo significa che aggiungere una terza lingua richiederebbe solo un nuovo file, senza modificare nient’altro, e che la manutenzione delle traduzioni è indipendente dallo sviluppo dell’applicazione.</w:t>
+      </w:r>
+    </w:p>
+    <w:p>
+      <w:pPr>
+        <w:spacing w:after="100"/>
+      </w:pPr>
+    </w:p>
+    <w:p>
+      <w:r>
+        <w:br w:type="page"/>
+      </w:r>
+    </w:p>
+    <w:p>
+      <w:pPr>
+        <w:pStyle w:val="Titolo1"/>
+        <w:pBdr>
+          <w:bottom w:val="single" w:sz="8" w:space="4" w:color="0077FF"/>
+        </w:pBdr>
+      </w:pPr>
+      <w:r>
+        <w:rPr>
+          <w:color w:val="1A3A6B"/>
+        </w:rPr>
+        <w:lastRenderedPageBreak/>
+        <w:t>3. Lato Server</w:t>
+      </w:r>
+    </w:p>
+    <w:p>
+      <w:pPr>
+        <w:spacing w:after="140"/>
+        <w:jc w:val="both"/>
+      </w:pPr>
+      <w:r>
+        <w:rPr>
+          <w:color w:val="0D2459"/>
+        </w:rPr>
+        <w:t>Il lato server di DiceRoll è composto da un unico file, server.py, che implementa il server WebSocket per la Party Chat. È una componente opzionale: l'applicazione funziona completamente anche senza server, che è necessario solo se si vuole usare la funzionalità multiplayer.</w:t>
+      </w:r>
+    </w:p>
+    <w:p>
+      <w:pPr>
+        <w:pStyle w:val="Titolo2"/>
+      </w:pPr>
+      <w:r>
+        <w:rPr>
+          <w:color w:val="0077FF"/>
+        </w:rPr>
+        <w:t>3.1 Python e asyncio</w:t>
+      </w:r>
+    </w:p>
+    <w:p>
+      <w:pPr>
+        <w:spacing w:after="140"/>
+        <w:jc w:val="both"/>
+      </w:pPr>
+      <w:r>
+        <w:rPr>
+          <w:color w:val="0D2459"/>
+        </w:rPr>
+        <w:t>Python è un linguaggio di programmazione ad alto livello, interpretato e a tipizzazione dinamica, rilasciato pubblicamente nel 1991 da Guido van Rossum. È noto per la sintassi chiara e leggibile, la ricca libreria standard e la facilità di prototipazione rapida. È oggi uno dei linguaggi più usati al mondo, tanto nello sviluppo web quanto nella data science e nell'automazione.</w:t>
+      </w:r>
+    </w:p>
+    <w:p>
+      <w:pPr>
+        <w:spacing w:after="140"/>
+        <w:jc w:val="both"/>
+      </w:pPr>
+      <w:r>
+        <w:rPr>
+          <w:color w:val="0D2459"/>
+        </w:rPr>
+        <w:t>Per il server di DiceRoll, Python è stato scelto per diverse ragioni: la libreria standard include asyncio per la programmazione asincrona, la libreria WebSockets di terze parti è matura e ben documentata, e la semplicità del linguaggio ha permesso di mantenere il server compatto — poche centinaia di righe — e facilmente leggibile e modificabile.</w:t>
+      </w:r>
+    </w:p>
+    <w:p>
+      <w:pPr>
+        <w:spacing w:after="140"/>
+        <w:jc w:val="both"/>
+      </w:pPr>
+      <w:r>
+        <w:rPr>
+          <w:color w:val="0D2459"/>
+        </w:rPr>
+        <w:t>Asyncio è il modulo della libreria standard di Python per la programmazione asincrona basata su coroutine e loop degli eventi. Il suo funzionamento è fondamentalmente diverso dal multithreading tradizionale: invece di lanciare un thread separato per ogni connessione (con tutti i problemi di sincronizzazione che ne derivano), asyncio gestisce più connessioni all'interno di un singolo thread, sospendendo le coroutine in attesa di I/O e riprendendo la loro esecuzione quando i dati sono disponibili. Questo modello è particolarmente efficiente per applicazioni di rete dove la maggior parte del tempo viene spesa in attesa di messaggi.</w:t>
+      </w:r>
+    </w:p>
+    <w:p>
+      <w:pPr>
+        <w:spacing w:before="80" w:after="140"/>
+        <w:jc w:val="both"/>
+      </w:pPr>
       <w:r>
         <w:rPr>
           <w:b/>
@@ -1341,7 +1457,7 @@
           <w:iCs/>
           <w:color w:val="0099CC"/>
         </w:rPr>
-        <w:t xml:space="preserve"> In breve: </w:t>
+        <w:t xml:space="preserve">💡 In breve: </w:t>
       </w:r>
       <w:r>
         <w:rPr>
@@ -1349,32 +1465,18 @@
           <w:iCs/>
           <w:color w:val="154E6B"/>
         </w:rPr>
-        <w:t>Il sistema di internazionalizzazione è stato sviluppato internamente seguendo lo stesso principio dei framework professionali: i testi sono separati dal codice dell’interfaccia e organizzati in file dizionario. Questo significa che aggiungere una terza lingua richiederebbe solo un nuovo file, senza modificare nient’altro, e che la manutenzione delle traduzioni è indipendente dallo sviluppo dell’applicazione.</w:t>
-      </w:r>
-    </w:p>
-    <w:p>
-      <w:pPr>
-        <w:spacing w:after="100"/>
-      </w:pPr>
-    </w:p>
-    <w:p>
-      <w:r>
-        <w:br w:type="page"/>
-      </w:r>
-    </w:p>
-    <w:p>
-      <w:pPr>
-        <w:pStyle w:val="Titolo1"/>
-        <w:pBdr>
-          <w:bottom w:val="single" w:sz="8" w:space="4" w:color="0077FF"/>
-        </w:pBdr>
-      </w:pPr>
-      <w:r>
-        <w:rPr>
-          <w:color w:val="1A3A6B"/>
-        </w:rPr>
-        <w:lastRenderedPageBreak/>
-        <w:t>3. Lato Server</w:t>
+        <w:t>Per un server di chat, il tempo di elaborazione effettiva è minimo: la maggior parte del tempo viene trascorsa ad aspettare che i giocatori inviino messaggi. asyncio sfrutta questi momenti di attesa per gestire le altre connessioni, rendendo possibile servire più utenti contemporaneamente con un singolo processo, senza la complessità del multithreading.</w:t>
+      </w:r>
+    </w:p>
+    <w:p>
+      <w:pPr>
+        <w:pStyle w:val="Titolo2"/>
+      </w:pPr>
+      <w:r>
+        <w:rPr>
+          <w:color w:val="0077FF"/>
+        </w:rPr>
+        <w:t>3.2 Il protocollo WebSocket</w:t>
       </w:r>
     </w:p>
     <w:p>
@@ -1386,18 +1488,7 @@
         <w:rPr>
           <w:color w:val="0D2459"/>
         </w:rPr>
-        <w:t>Il lato server di DiceRoll è composto da un unico file, server.py, che implementa il server WebSocket per la Party Chat. È una componente opzionale: l'applicazione funziona completamente anche senza server, che è necessario solo se si vuole usare la funzionalità multiplayer.</w:t>
-      </w:r>
-    </w:p>
-    <w:p>
-      <w:pPr>
-        <w:pStyle w:val="Titolo2"/>
-      </w:pPr>
-      <w:r>
-        <w:rPr>
-          <w:color w:val="0077FF"/>
-        </w:rPr>
-        <w:t>3.1 Python e asyncio</w:t>
+        <w:t>WebSocket (standardizzato nella RFC 6455) è un protocollo di comunicazione che nasce come estensione di HTTP ma se ne distacca profondamente nel comportamento. La connessione inizia con un handshake HTTP (l'Upgrade request), al termine del quale il protocollo viene 'promosso' a WebSocket: da quel momento la connessione TCP rimane aperta e sia il client che il server possono inviare messaggi in qualsiasi momento, senza attendere una richiesta.</w:t>
       </w:r>
     </w:p>
     <w:p>
@@ -1409,31 +1500,7 @@
         <w:rPr>
           <w:color w:val="0D2459"/>
         </w:rPr>
-        <w:t>Python è un linguaggio di programmazione ad alto livello, interpretato e a tipizzazione dinamica, rilasciato pubblicamente nel 1991 da Guido van Rossum. È noto per la sintassi chiara e leggibile, la ricca libreria standard e la facilità di prototipazione rapida. È oggi uno dei linguaggi più usati al mondo, tanto nello sviluppo web quanto nella data science e nell'automazione.</w:t>
-      </w:r>
-    </w:p>
-    <w:p>
-      <w:pPr>
-        <w:spacing w:after="140"/>
-        <w:jc w:val="both"/>
-      </w:pPr>
-      <w:r>
-        <w:rPr>
-          <w:color w:val="0D2459"/>
-        </w:rPr>
-        <w:t>Per il server di DiceRoll, Python è stato scelto per diverse ragioni: la libreria standard include asyncio per la programmazione asincrona, la libreria WebSockets di terze parti è matura e ben documentata, e la semplicità del linguaggio ha permesso di mantenere il server compatto — poche centinaia di righe — e facilmente leggibile e modificabile.</w:t>
-      </w:r>
-    </w:p>
-    <w:p>
-      <w:pPr>
-        <w:spacing w:after="140"/>
-        <w:jc w:val="both"/>
-      </w:pPr>
-      <w:r>
-        <w:rPr>
-          <w:color w:val="0D2459"/>
-        </w:rPr>
-        <w:t>Asyncio è il modulo della libreria standard di Python per la programmazione asincrona basata su coroutine e loop degli eventi. Il suo funzionamento è fondamentalmente diverso dal multithreading tradizionale: invece di lanciare un thread separato per ogni connessione (con tutti i problemi di sincronizzazione che ne derivano), asyncio gestisce più connessioni all'interno di un singolo thread, sospendendo le coroutine in attesa di I/O e riprendendo la loro esecuzione quando i dati sono disponibili. Questo modello è particolarmente efficiente per applicazioni di rete dove la maggior parte del tempo viene spesa in attesa di messaggi.</w:t>
+        <w:t>Questo modello full-duplex è essenziale per una chat in tempo reale: con il tradizionale HTTP, il client dovrebbe interrogare il server continuamente (polling) per sapere se ci sono nuovi messaggi, con un overhead significativo. WebSocket elimina completamente questo problema, consentendo al server di spingere i messaggi ai client nel momento in cui sono disponibili.</w:t>
       </w:r>
     </w:p>
     <w:p>
@@ -1449,8 +1516,88 @@
           <w:iCs/>
           <w:color w:val="0099CC"/>
         </w:rPr>
-        <w:t>💡</w:t>
-      </w:r>
+        <w:t xml:space="preserve">💡 In breve: </w:t>
+      </w:r>
+      <w:r>
+        <w:rPr>
+          <w:i/>
+          <w:iCs/>
+          <w:color w:val="154E6B"/>
+        </w:rPr>
+        <w:t>La differenza fondamentale rispetto a HTTP è che con WebSocket la connessione rimane aperta e il server può inviare messaggi ai client in qualsiasi momento, senza aspettare che siano loro a chiedere. Per una chat in tempo reale questo è essenziale: con HTTP si dovrebbe interrogare il server continuamente per sapere se ci sono novità, con un notevole spreco di risorse.</w:t>
+      </w:r>
+    </w:p>
+    <w:p>
+      <w:pPr>
+        <w:spacing w:after="140"/>
+        <w:jc w:val="both"/>
+      </w:pPr>
+      <w:r>
+        <w:rPr>
+          <w:color w:val="0D2459"/>
+        </w:rPr>
+        <w:t xml:space="preserve">In DiceRoll, tutti i messaggi scambiati tra client e server sono oggetti JSON. Il campo type indica il tipo di operazione, e il payload varia di conseguenza. I tipi gestiti sono: create (crea </w:t>
+      </w:r>
+      <w:r>
+        <w:rPr>
+          <w:color w:val="0D2459"/>
+        </w:rPr>
+        <w:lastRenderedPageBreak/>
+        <w:t>una nuova stanza protetta da password), join (accede a una stanza esistente), message (distribuisce un messaggio — testo o immagine codificata in base64 — a tutti i partecipanti), leave (abbandona la stanza) e ping/pong (heartbeat automatico che permette di tenere in vita la connessione).</w:t>
+      </w:r>
+    </w:p>
+    <w:p>
+      <w:pPr>
+        <w:pStyle w:val="Titolo2"/>
+      </w:pPr>
+      <w:r>
+        <w:rPr>
+          <w:color w:val="0077FF"/>
+        </w:rPr>
+        <w:t>3.3 Architettura delle stanze</w:t>
+      </w:r>
+    </w:p>
+    <w:p>
+      <w:pPr>
+        <w:spacing w:after="140"/>
+        <w:jc w:val="both"/>
+      </w:pPr>
+      <w:r>
+        <w:rPr>
+          <w:color w:val="0D2459"/>
+        </w:rPr>
+        <w:t>Il server organizza i client in stanze, identificate dalla password scelta dal primo giocatore che la crea. Password diverse corrispondono a stanze distinte e completamente isolate: i messaggi di una stanza non raggiungono mai i partecipanti di un'altra.</w:t>
+      </w:r>
+    </w:p>
+    <w:p>
+      <w:pPr>
+        <w:spacing w:after="140"/>
+        <w:jc w:val="both"/>
+      </w:pPr>
+      <w:r>
+        <w:rPr>
+          <w:color w:val="0D2459"/>
+        </w:rPr>
+        <w:t>Oltre alla porta WebSocket 8765, il server espone un semplice endpoint HTTP sulla porta 8766 che risponde con il proprio indirizzo IP. Questo endpoint è usato dal client per la funzione di Auto-detect: cliccando il pulsante apposito nella tab Party, l'applicazione interroga automaticamente il server e compila il campo IP senza che l'utente debba cercarlo manualmente.</w:t>
+      </w:r>
+    </w:p>
+    <w:p>
+      <w:pPr>
+        <w:spacing w:after="140"/>
+        <w:jc w:val="both"/>
+      </w:pPr>
+      <w:r>
+        <w:rPr>
+          <w:color w:val="0D2459"/>
+        </w:rPr>
+        <w:t>In caso di disconnessione improvvisa, il client tenta automaticamente la riconnessione fino a tre volte, con un intervallo crescente tra un tentativo e il successivo. Il server notifica tutti i partecipanti della stanza quando un utente si disconnette o si riconnette, mantenendo sempre aggiornato lo stato della sessione.</w:t>
+      </w:r>
+    </w:p>
+    <w:p>
+      <w:pPr>
+        <w:spacing w:before="80" w:after="140"/>
+        <w:jc w:val="both"/>
+      </w:pPr>
       <w:r>
         <w:rPr>
           <w:b/>
@@ -1459,176 +1606,7 @@
           <w:iCs/>
           <w:color w:val="0099CC"/>
         </w:rPr>
-        <w:t xml:space="preserve"> In breve: </w:t>
-      </w:r>
-      <w:r>
-        <w:rPr>
-          <w:i/>
-          <w:iCs/>
-          <w:color w:val="154E6B"/>
-        </w:rPr>
-        <w:t>Per un server di chat, il tempo di elaborazione effettiva è minimo: la maggior parte del tempo viene trascorsa ad aspettare che i giocatori inviino messaggi. asyncio sfrutta questi momenti di attesa per gestire le altre connessioni, rendendo possibile servire più utenti contemporaneamente con un singolo processo, senza la complessità del multithreading.</w:t>
-      </w:r>
-    </w:p>
-    <w:p>
-      <w:pPr>
-        <w:pStyle w:val="Titolo2"/>
-      </w:pPr>
-      <w:r>
-        <w:rPr>
-          <w:color w:val="0077FF"/>
-        </w:rPr>
-        <w:t>3.2 Il protocollo WebSocket</w:t>
-      </w:r>
-    </w:p>
-    <w:p>
-      <w:pPr>
-        <w:spacing w:after="140"/>
-        <w:jc w:val="both"/>
-      </w:pPr>
-      <w:r>
-        <w:rPr>
-          <w:color w:val="0D2459"/>
-        </w:rPr>
-        <w:t>WebSocket (standardizzato nella RFC 6455) è un protocollo di comunicazione che nasce come estensione di HTTP ma se ne distacca profondamente nel comportamento. La connessione inizia con un handshake HTTP (l'Upgrade request), al termine del quale il protocollo viene 'promosso' a WebSocket: da quel momento la connessione TCP rimane aperta e sia il client che il server possono inviare messaggi in qualsiasi momento, senza attendere una richiesta.</w:t>
-      </w:r>
-    </w:p>
-    <w:p>
-      <w:pPr>
-        <w:spacing w:after="140"/>
-        <w:jc w:val="both"/>
-      </w:pPr>
-      <w:r>
-        <w:rPr>
-          <w:color w:val="0D2459"/>
-        </w:rPr>
-        <w:t>Questo modello full-duplex è essenziale per una chat in tempo reale: con il tradizionale HTTP, il client dovrebbe interrogare il server continuamente (polling) per sapere se ci sono nuovi messaggi, con un overhead significativo. WebSocket elimina completamente questo problema, consentendo al server di spingere i messaggi ai client nel momento in cui sono disponibili.</w:t>
-      </w:r>
-    </w:p>
-    <w:p>
-      <w:pPr>
-        <w:spacing w:before="80" w:after="140"/>
-        <w:jc w:val="both"/>
-      </w:pPr>
-      <w:r>
-        <w:rPr>
-          <w:b/>
-          <w:bCs/>
-          <w:i/>
-          <w:iCs/>
-          <w:color w:val="0099CC"/>
-        </w:rPr>
-        <w:t>💡</w:t>
-      </w:r>
-      <w:r>
-        <w:rPr>
-          <w:b/>
-          <w:bCs/>
-          <w:i/>
-          <w:iCs/>
-          <w:color w:val="0099CC"/>
-        </w:rPr>
-        <w:t xml:space="preserve"> In breve: </w:t>
-      </w:r>
-      <w:r>
-        <w:rPr>
-          <w:i/>
-          <w:iCs/>
-          <w:color w:val="154E6B"/>
-        </w:rPr>
-        <w:t>La differenza fondamentale rispetto a HTTP è che con WebSocket la connessione rimane aperta e il server può inviare messaggi ai client in qualsiasi momento, senza aspettare che siano loro a chiedere. Per una chat in tempo reale questo è essenziale: con HTTP si dovrebbe interrogare il server continuamente per sapere se ci sono novità, con un notevole spreco di risorse.</w:t>
-      </w:r>
-    </w:p>
-    <w:p>
-      <w:pPr>
-        <w:spacing w:after="140"/>
-        <w:jc w:val="both"/>
-      </w:pPr>
-      <w:r>
-        <w:rPr>
-          <w:color w:val="0D2459"/>
-        </w:rPr>
-        <w:t xml:space="preserve">In DiceRoll, tutti i messaggi scambiati tra client e server sono oggetti JSON. Il campo type indica il tipo di operazione, e il payload varia di conseguenza. I tipi gestiti sono: create (crea </w:t>
-      </w:r>
-      <w:r>
-        <w:rPr>
-          <w:color w:val="0D2459"/>
-        </w:rPr>
-        <w:lastRenderedPageBreak/>
-        <w:t>una nuova stanza protetta da password), join (accede a una stanza esistente), message (distribuisce un messaggio — testo o immagine codificata in base64 — a tutti i partecipanti), leave (abbandona la stanza) e ping/pong (heartbeat automatico che permette di tenere in vita la connessione).</w:t>
-      </w:r>
-    </w:p>
-    <w:p>
-      <w:pPr>
-        <w:pStyle w:val="Titolo2"/>
-      </w:pPr>
-      <w:r>
-        <w:rPr>
-          <w:color w:val="0077FF"/>
-        </w:rPr>
-        <w:t>3.3 Architettura delle stanze</w:t>
-      </w:r>
-    </w:p>
-    <w:p>
-      <w:pPr>
-        <w:spacing w:after="140"/>
-        <w:jc w:val="both"/>
-      </w:pPr>
-      <w:r>
-        <w:rPr>
-          <w:color w:val="0D2459"/>
-        </w:rPr>
-        <w:t>Il server organizza i client in stanze, identificate dalla password scelta dal primo giocatore che la crea. Password diverse corrispondono a stanze distinte e completamente isolate: i messaggi di una stanza non raggiungono mai i partecipanti di un'altra.</w:t>
-      </w:r>
-    </w:p>
-    <w:p>
-      <w:pPr>
-        <w:spacing w:after="140"/>
-        <w:jc w:val="both"/>
-      </w:pPr>
-      <w:r>
-        <w:rPr>
-          <w:color w:val="0D2459"/>
-        </w:rPr>
-        <w:t>Oltre alla porta WebSocket 8765, il server espone un semplice endpoint HTTP sulla porta 8766 che risponde con il proprio indirizzo IP. Questo endpoint è usato dal client per la funzione di Auto-detect: cliccando il pulsante apposito nella tab Party, l'applicazione interroga automaticamente il server e compila il campo IP senza che l'utente debba cercarlo manualmente.</w:t>
-      </w:r>
-    </w:p>
-    <w:p>
-      <w:pPr>
-        <w:spacing w:after="140"/>
-        <w:jc w:val="both"/>
-      </w:pPr>
-      <w:r>
-        <w:rPr>
-          <w:color w:val="0D2459"/>
-        </w:rPr>
-        <w:t>In caso di disconnessione improvvisa, il client tenta automaticamente la riconnessione fino a tre volte, con un intervallo crescente tra un tentativo e il successivo. Il server notifica tutti i partecipanti della stanza quando un utente si disconnette o si riconnette, mantenendo sempre aggiornato lo stato della sessione.</w:t>
-      </w:r>
-    </w:p>
-    <w:p>
-      <w:pPr>
-        <w:spacing w:before="80" w:after="140"/>
-        <w:jc w:val="both"/>
-      </w:pPr>
-      <w:r>
-        <w:rPr>
-          <w:b/>
-          <w:bCs/>
-          <w:i/>
-          <w:iCs/>
-          <w:color w:val="0099CC"/>
-        </w:rPr>
-        <w:t>💡</w:t>
-      </w:r>
-      <w:r>
-        <w:rPr>
-          <w:b/>
-          <w:bCs/>
-          <w:i/>
-          <w:iCs/>
-          <w:color w:val="0099CC"/>
-        </w:rPr>
-        <w:t xml:space="preserve"> In breve: </w:t>
+        <w:t xml:space="preserve">💡 In breve: </w:t>
       </w:r>
       <w:r>
         <w:rPr>
@@ -2076,13 +2054,7 @@
         <w:rPr>
           <w:color w:val="0D2459"/>
         </w:rPr>
-        <w:t>Git è il sistema di controllo versione distribuito più diffuso al mondo. Consente di registrare ogni modifica apportata al codice in forma di commit, navigare lo storico delle versioni, lavorare su funzionalità parallele tramite branch e tornare a uno stato precedente in caso di regressioni. Per DiceRoll, Git ha permesso di sperimentare nuove funzionalità — come il sistema delle mappe o la gestione dei temi — su branch separati, integrando le modifiche nel ramo principale solo a sviluppo completato e verifi</w:t>
-      </w:r>
-      <w:r>
-        <w:rPr>
-          <w:color w:val="0D2459"/>
-        </w:rPr>
-        <w:t>cato.</w:t>
+        <w:t>Git è il sistema di controllo versione distribuito più diffuso al mondo. Consente di registrare ogni modifica apportata al codice in forma di commit, navigare lo storico delle versioni, lavorare su funzionalità parallele tramite branch e tornare a uno stato precedente in caso di regressioni. Per DiceRoll, Git ha permesso di sperimentare nuove funzionalità — come il sistema delle mappe o la gestione dei temi — su branch separati, integrando le modifiche nel ramo principale solo a sviluppo completato e verificato.</w:t>
       </w:r>
     </w:p>
     <w:p>
@@ -2139,6 +2111,7 @@
           <w:numId w:val="2"/>
         </w:numPr>
         <w:spacing w:after="80"/>
+        <w:jc w:val="both"/>
       </w:pPr>
       <w:r>
         <w:rPr>
@@ -2163,6 +2136,7 @@
           <w:numId w:val="2"/>
         </w:numPr>
         <w:spacing w:after="80"/>
+        <w:jc w:val="both"/>
       </w:pPr>
       <w:r>
         <w:rPr>
@@ -2187,6 +2161,7 @@
           <w:numId w:val="2"/>
         </w:numPr>
         <w:spacing w:after="80"/>
+        <w:jc w:val="both"/>
       </w:pPr>
       <w:r>
         <w:rPr>
@@ -2211,6 +2186,7 @@
           <w:numId w:val="2"/>
         </w:numPr>
         <w:spacing w:after="80"/>
+        <w:jc w:val="both"/>
       </w:pPr>
       <w:r>
         <w:rPr>
@@ -2275,13 +2251,13 @@
         <w:tblLook w:val="0000" w:firstRow="0" w:lastRow="0" w:firstColumn="0" w:lastColumn="0" w:noHBand="0" w:noVBand="0"/>
       </w:tblPr>
       <w:tblGrid>
-        <w:gridCol w:w="3800"/>
-        <w:gridCol w:w="5226"/>
+        <w:gridCol w:w="4110"/>
+        <w:gridCol w:w="4916"/>
       </w:tblGrid>
       <w:tr>
         <w:tc>
           <w:tcPr>
-            <w:tcW w:w="3800" w:type="dxa"/>
+            <w:tcW w:w="4110" w:type="dxa"/>
             <w:tcBorders>
               <w:top w:val="single" w:sz="1" w:space="0" w:color="A0C8E0"/>
               <w:left w:val="single" w:sz="1" w:space="0" w:color="A0C8E0"/>
@@ -2309,7 +2285,7 @@
         </w:tc>
         <w:tc>
           <w:tcPr>
-            <w:tcW w:w="5226" w:type="dxa"/>
+            <w:tcW w:w="4916" w:type="dxa"/>
             <w:tcBorders>
               <w:top w:val="single" w:sz="1" w:space="0" w:color="A0C8E0"/>
               <w:left w:val="single" w:sz="1" w:space="0" w:color="A0C8E0"/>
@@ -2339,7 +2315,7 @@
       <w:tr>
         <w:tc>
           <w:tcPr>
-            <w:tcW w:w="3800" w:type="dxa"/>
+            <w:tcW w:w="4110" w:type="dxa"/>
             <w:tcBorders>
               <w:top w:val="single" w:sz="1" w:space="0" w:color="A0C8E0"/>
               <w:left w:val="single" w:sz="1" w:space="0" w:color="A0C8E0"/>
@@ -2367,7 +2343,7 @@
         </w:tc>
         <w:tc>
           <w:tcPr>
-            <w:tcW w:w="5226" w:type="dxa"/>
+            <w:tcW w:w="4916" w:type="dxa"/>
             <w:tcBorders>
               <w:top w:val="single" w:sz="1" w:space="0" w:color="A0C8E0"/>
               <w:left w:val="single" w:sz="1" w:space="0" w:color="A0C8E0"/>
@@ -2395,7 +2371,7 @@
       <w:tr>
         <w:tc>
           <w:tcPr>
-            <w:tcW w:w="3800" w:type="dxa"/>
+            <w:tcW w:w="4110" w:type="dxa"/>
             <w:tcBorders>
               <w:top w:val="single" w:sz="1" w:space="0" w:color="A0C8E0"/>
               <w:left w:val="single" w:sz="1" w:space="0" w:color="A0C8E0"/>
@@ -2423,7 +2399,7 @@
         </w:tc>
         <w:tc>
           <w:tcPr>
-            <w:tcW w:w="5226" w:type="dxa"/>
+            <w:tcW w:w="4916" w:type="dxa"/>
             <w:tcBorders>
               <w:top w:val="single" w:sz="1" w:space="0" w:color="A0C8E0"/>
               <w:left w:val="single" w:sz="1" w:space="0" w:color="A0C8E0"/>
@@ -2451,7 +2427,7 @@
       <w:tr>
         <w:tc>
           <w:tcPr>
-            <w:tcW w:w="3800" w:type="dxa"/>
+            <w:tcW w:w="4110" w:type="dxa"/>
             <w:tcBorders>
               <w:top w:val="single" w:sz="1" w:space="0" w:color="A0C8E0"/>
               <w:left w:val="single" w:sz="1" w:space="0" w:color="A0C8E0"/>
@@ -2479,7 +2455,7 @@
         </w:tc>
         <w:tc>
           <w:tcPr>
-            <w:tcW w:w="5226" w:type="dxa"/>
+            <w:tcW w:w="4916" w:type="dxa"/>
             <w:tcBorders>
               <w:top w:val="single" w:sz="1" w:space="0" w:color="A0C8E0"/>
               <w:left w:val="single" w:sz="1" w:space="0" w:color="A0C8E0"/>
@@ -2507,7 +2483,7 @@
       <w:tr>
         <w:tc>
           <w:tcPr>
-            <w:tcW w:w="3800" w:type="dxa"/>
+            <w:tcW w:w="4110" w:type="dxa"/>
             <w:tcBorders>
               <w:top w:val="single" w:sz="1" w:space="0" w:color="A0C8E0"/>
               <w:left w:val="single" w:sz="1" w:space="0" w:color="A0C8E0"/>
@@ -2535,7 +2511,7 @@
         </w:tc>
         <w:tc>
           <w:tcPr>
-            <w:tcW w:w="5226" w:type="dxa"/>
+            <w:tcW w:w="4916" w:type="dxa"/>
             <w:tcBorders>
               <w:top w:val="single" w:sz="1" w:space="0" w:color="A0C8E0"/>
               <w:left w:val="single" w:sz="1" w:space="0" w:color="A0C8E0"/>
@@ -2563,7 +2539,7 @@
       <w:tr>
         <w:tc>
           <w:tcPr>
-            <w:tcW w:w="3800" w:type="dxa"/>
+            <w:tcW w:w="4110" w:type="dxa"/>
             <w:tcBorders>
               <w:top w:val="single" w:sz="1" w:space="0" w:color="A0C8E0"/>
               <w:left w:val="single" w:sz="1" w:space="0" w:color="A0C8E0"/>
@@ -2591,7 +2567,7 @@
         </w:tc>
         <w:tc>
           <w:tcPr>
-            <w:tcW w:w="5226" w:type="dxa"/>
+            <w:tcW w:w="4916" w:type="dxa"/>
             <w:tcBorders>
               <w:top w:val="single" w:sz="1" w:space="0" w:color="A0C8E0"/>
               <w:left w:val="single" w:sz="1" w:space="0" w:color="A0C8E0"/>
@@ -2619,7 +2595,7 @@
       <w:tr>
         <w:tc>
           <w:tcPr>
-            <w:tcW w:w="3800" w:type="dxa"/>
+            <w:tcW w:w="4110" w:type="dxa"/>
             <w:tcBorders>
               <w:top w:val="single" w:sz="1" w:space="0" w:color="A0C8E0"/>
               <w:left w:val="single" w:sz="1" w:space="0" w:color="A0C8E0"/>
@@ -2647,7 +2623,7 @@
         </w:tc>
         <w:tc>
           <w:tcPr>
-            <w:tcW w:w="5226" w:type="dxa"/>
+            <w:tcW w:w="4916" w:type="dxa"/>
             <w:tcBorders>
               <w:top w:val="single" w:sz="1" w:space="0" w:color="A0C8E0"/>
               <w:left w:val="single" w:sz="1" w:space="0" w:color="A0C8E0"/>
@@ -2681,7 +2657,7 @@
       <w:tr>
         <w:tc>
           <w:tcPr>
-            <w:tcW w:w="3800" w:type="dxa"/>
+            <w:tcW w:w="4110" w:type="dxa"/>
             <w:tcBorders>
               <w:top w:val="single" w:sz="1" w:space="0" w:color="A0C8E0"/>
               <w:left w:val="single" w:sz="1" w:space="0" w:color="A0C8E0"/>
@@ -2709,7 +2685,7 @@
         </w:tc>
         <w:tc>
           <w:tcPr>
-            <w:tcW w:w="5226" w:type="dxa"/>
+            <w:tcW w:w="4916" w:type="dxa"/>
             <w:tcBorders>
               <w:top w:val="single" w:sz="1" w:space="0" w:color="A0C8E0"/>
               <w:left w:val="single" w:sz="1" w:space="0" w:color="A0C8E0"/>
@@ -2737,7 +2713,7 @@
       <w:tr>
         <w:tc>
           <w:tcPr>
-            <w:tcW w:w="3800" w:type="dxa"/>
+            <w:tcW w:w="4110" w:type="dxa"/>
             <w:tcBorders>
               <w:top w:val="single" w:sz="1" w:space="0" w:color="A0C8E0"/>
               <w:left w:val="single" w:sz="1" w:space="0" w:color="A0C8E0"/>
@@ -2765,7 +2741,7 @@
         </w:tc>
         <w:tc>
           <w:tcPr>
-            <w:tcW w:w="5226" w:type="dxa"/>
+            <w:tcW w:w="4916" w:type="dxa"/>
             <w:tcBorders>
               <w:top w:val="single" w:sz="1" w:space="0" w:color="A0C8E0"/>
               <w:left w:val="single" w:sz="1" w:space="0" w:color="A0C8E0"/>
@@ -2793,7 +2769,7 @@
       <w:tr>
         <w:tc>
           <w:tcPr>
-            <w:tcW w:w="3800" w:type="dxa"/>
+            <w:tcW w:w="4110" w:type="dxa"/>
             <w:tcBorders>
               <w:top w:val="single" w:sz="1" w:space="0" w:color="A0C8E0"/>
               <w:left w:val="single" w:sz="1" w:space="0" w:color="A0C8E0"/>
@@ -2821,7 +2797,7 @@
         </w:tc>
         <w:tc>
           <w:tcPr>
-            <w:tcW w:w="5226" w:type="dxa"/>
+            <w:tcW w:w="4916" w:type="dxa"/>
             <w:tcBorders>
               <w:top w:val="single" w:sz="1" w:space="0" w:color="A0C8E0"/>
               <w:left w:val="single" w:sz="1" w:space="0" w:color="A0C8E0"/>
@@ -2849,7 +2825,7 @@
       <w:tr>
         <w:tc>
           <w:tcPr>
-            <w:tcW w:w="3800" w:type="dxa"/>
+            <w:tcW w:w="4110" w:type="dxa"/>
             <w:tcBorders>
               <w:top w:val="single" w:sz="1" w:space="0" w:color="A0C8E0"/>
               <w:left w:val="single" w:sz="1" w:space="0" w:color="A0C8E0"/>
@@ -2877,7 +2853,7 @@
         </w:tc>
         <w:tc>
           <w:tcPr>
-            <w:tcW w:w="5226" w:type="dxa"/>
+            <w:tcW w:w="4916" w:type="dxa"/>
             <w:tcBorders>
               <w:top w:val="single" w:sz="1" w:space="0" w:color="A0C8E0"/>
               <w:left w:val="single" w:sz="1" w:space="0" w:color="A0C8E0"/>
@@ -2905,7 +2881,7 @@
       <w:tr>
         <w:tc>
           <w:tcPr>
-            <w:tcW w:w="3800" w:type="dxa"/>
+            <w:tcW w:w="4110" w:type="dxa"/>
             <w:tcBorders>
               <w:top w:val="single" w:sz="1" w:space="0" w:color="A0C8E0"/>
               <w:left w:val="single" w:sz="1" w:space="0" w:color="A0C8E0"/>
@@ -2933,7 +2909,7 @@
         </w:tc>
         <w:tc>
           <w:tcPr>
-            <w:tcW w:w="5226" w:type="dxa"/>
+            <w:tcW w:w="4916" w:type="dxa"/>
             <w:tcBorders>
               <w:top w:val="single" w:sz="1" w:space="0" w:color="A0C8E0"/>
               <w:left w:val="single" w:sz="1" w:space="0" w:color="A0C8E0"/>
@@ -2961,7 +2937,7 @@
       <w:tr>
         <w:tc>
           <w:tcPr>
-            <w:tcW w:w="3800" w:type="dxa"/>
+            <w:tcW w:w="4110" w:type="dxa"/>
             <w:tcBorders>
               <w:top w:val="single" w:sz="1" w:space="0" w:color="A0C8E0"/>
               <w:left w:val="single" w:sz="1" w:space="0" w:color="A0C8E0"/>
@@ -2989,7 +2965,7 @@
         </w:tc>
         <w:tc>
           <w:tcPr>
-            <w:tcW w:w="5226" w:type="dxa"/>
+            <w:tcW w:w="4916" w:type="dxa"/>
             <w:tcBorders>
               <w:top w:val="single" w:sz="1" w:space="0" w:color="A0C8E0"/>
               <w:left w:val="single" w:sz="1" w:space="0" w:color="A0C8E0"/>
@@ -3021,10 +2997,1003 @@
       </w:pPr>
     </w:p>
     <w:p>
-      <w:r>
-        <w:br w:type="page"/>
-      </w:r>
-    </w:p>
+      <w:pPr>
+        <w:pStyle w:val="Titolo2"/>
+      </w:pPr>
+      <w:r>
+        <w:rPr>
+          <w:color w:val="0077FF"/>
+        </w:rPr>
+        <w:t>6.1</w:t>
+      </w:r>
+      <w:r>
+        <w:rPr>
+          <w:color w:val="0077FF"/>
+        </w:rPr>
+        <w:t xml:space="preserve"> </w:t>
+      </w:r>
+      <w:r>
+        <w:rPr>
+          <w:color w:val="2E86DE"/>
+        </w:rPr>
+        <w:t>Motivazione dietro alle tecnologie utilizzate</w:t>
+      </w:r>
+    </w:p>
+    <w:tbl>
+      <w:tblPr>
+        <w:tblW w:w="9026" w:type="dxa"/>
+        <w:tblBorders>
+          <w:top w:val="single" w:sz="4" w:space="0" w:color="auto"/>
+          <w:left w:val="single" w:sz="4" w:space="0" w:color="auto"/>
+          <w:bottom w:val="single" w:sz="4" w:space="0" w:color="auto"/>
+          <w:right w:val="single" w:sz="4" w:space="0" w:color="auto"/>
+          <w:insideH w:val="single" w:sz="4" w:space="0" w:color="auto"/>
+          <w:insideV w:val="single" w:sz="4" w:space="0" w:color="auto"/>
+        </w:tblBorders>
+        <w:tblCellMar>
+          <w:left w:w="10" w:type="dxa"/>
+          <w:right w:w="10" w:type="dxa"/>
+        </w:tblCellMar>
+        <w:tblLook w:val="0000" w:firstRow="0" w:lastRow="0" w:firstColumn="0" w:lastColumn="0" w:noHBand="0" w:noVBand="0"/>
+      </w:tblPr>
+      <w:tblGrid>
+        <w:gridCol w:w="4110"/>
+        <w:gridCol w:w="4916"/>
+      </w:tblGrid>
+      <w:tr>
+        <w:tc>
+          <w:tcPr>
+            <w:tcW w:w="4110" w:type="dxa"/>
+            <w:tcBorders>
+              <w:top w:val="single" w:sz="1" w:space="0" w:color="A0C8E0"/>
+              <w:left w:val="single" w:sz="1" w:space="0" w:color="A0C8E0"/>
+              <w:bottom w:val="single" w:sz="1" w:space="0" w:color="A0C8E0"/>
+              <w:right w:val="single" w:sz="1" w:space="0" w:color="A0C8E0"/>
+            </w:tcBorders>
+            <w:shd w:val="clear" w:color="auto" w:fill="1A3A6B"/>
+            <w:tcMar>
+              <w:top w:w="100" w:type="dxa"/>
+              <w:left w:w="150" w:type="dxa"/>
+              <w:bottom w:w="100" w:type="dxa"/>
+              <w:right w:w="150" w:type="dxa"/>
+            </w:tcMar>
+          </w:tcPr>
+          <w:p>
+            <w:pPr>
+              <w:jc w:val="both"/>
+              <w:rPr>
+                <w:b/>
+                <w:bCs/>
+              </w:rPr>
+            </w:pPr>
+            <w:r>
+              <w:rPr>
+                <w:b/>
+                <w:bCs/>
+              </w:rPr>
+              <w:t>Tecnologia</w:t>
+            </w:r>
+          </w:p>
+        </w:tc>
+        <w:tc>
+          <w:tcPr>
+            <w:tcW w:w="4916" w:type="dxa"/>
+            <w:tcBorders>
+              <w:top w:val="single" w:sz="1" w:space="0" w:color="A0C8E0"/>
+              <w:left w:val="single" w:sz="1" w:space="0" w:color="A0C8E0"/>
+              <w:bottom w:val="single" w:sz="1" w:space="0" w:color="A0C8E0"/>
+              <w:right w:val="single" w:sz="1" w:space="0" w:color="A0C8E0"/>
+            </w:tcBorders>
+            <w:shd w:val="clear" w:color="auto" w:fill="1A3A6B"/>
+            <w:tcMar>
+              <w:top w:w="100" w:type="dxa"/>
+              <w:left w:w="150" w:type="dxa"/>
+              <w:bottom w:w="100" w:type="dxa"/>
+              <w:right w:w="150" w:type="dxa"/>
+            </w:tcMar>
+          </w:tcPr>
+          <w:p>
+            <w:r>
+              <w:rPr>
+                <w:b/>
+                <w:bCs/>
+                <w:color w:val="FFFFFF"/>
+              </w:rPr>
+              <w:t>Perché è stata scelta?</w:t>
+            </w:r>
+          </w:p>
+        </w:tc>
+      </w:tr>
+      <w:tr>
+        <w:tc>
+          <w:tcPr>
+            <w:tcW w:w="4110" w:type="dxa"/>
+            <w:tcBorders>
+              <w:top w:val="single" w:sz="1" w:space="0" w:color="A0C8E0"/>
+              <w:left w:val="single" w:sz="1" w:space="0" w:color="A0C8E0"/>
+              <w:bottom w:val="single" w:sz="1" w:space="0" w:color="A0C8E0"/>
+              <w:right w:val="single" w:sz="1" w:space="0" w:color="A0C8E0"/>
+            </w:tcBorders>
+            <w:shd w:val="clear" w:color="auto" w:fill="D4F5EE"/>
+            <w:tcMar>
+              <w:top w:w="90" w:type="dxa"/>
+              <w:left w:w="150" w:type="dxa"/>
+              <w:bottom w:w="90" w:type="dxa"/>
+              <w:right w:w="150" w:type="dxa"/>
+            </w:tcMar>
+          </w:tcPr>
+          <w:p>
+            <w:r>
+              <w:rPr>
+                <w:b/>
+                <w:bCs/>
+                <w:color w:val="1A3A6B"/>
+              </w:rPr>
+              <w:t>HTML5</w:t>
+            </w:r>
+          </w:p>
+        </w:tc>
+        <w:tc>
+          <w:tcPr>
+            <w:tcW w:w="4916" w:type="dxa"/>
+            <w:tcBorders>
+              <w:top w:val="single" w:sz="1" w:space="0" w:color="A0C8E0"/>
+              <w:left w:val="single" w:sz="1" w:space="0" w:color="A0C8E0"/>
+              <w:bottom w:val="single" w:sz="1" w:space="0" w:color="A0C8E0"/>
+              <w:right w:val="single" w:sz="1" w:space="0" w:color="A0C8E0"/>
+            </w:tcBorders>
+            <w:shd w:val="clear" w:color="auto" w:fill="D4F5EE"/>
+            <w:tcMar>
+              <w:top w:w="90" w:type="dxa"/>
+              <w:left w:w="150" w:type="dxa"/>
+              <w:bottom w:w="90" w:type="dxa"/>
+              <w:right w:w="150" w:type="dxa"/>
+            </w:tcMar>
+          </w:tcPr>
+          <w:p>
+            <w:pPr>
+              <w:rPr>
+                <w:color w:val="0D2459"/>
+              </w:rPr>
+            </w:pPr>
+            <w:r>
+              <w:rPr>
+                <w:color w:val="0D2459"/>
+              </w:rPr>
+              <w:t>Struttura dell’interfaccia</w:t>
+            </w:r>
+          </w:p>
+        </w:tc>
+      </w:tr>
+      <w:tr>
+        <w:tc>
+          <w:tcPr>
+            <w:tcW w:w="4110" w:type="dxa"/>
+            <w:tcBorders>
+              <w:top w:val="single" w:sz="1" w:space="0" w:color="A0C8E0"/>
+              <w:left w:val="single" w:sz="1" w:space="0" w:color="A0C8E0"/>
+              <w:bottom w:val="single" w:sz="1" w:space="0" w:color="A0C8E0"/>
+              <w:right w:val="single" w:sz="1" w:space="0" w:color="A0C8E0"/>
+            </w:tcBorders>
+            <w:shd w:val="clear" w:color="auto" w:fill="FFFFFF"/>
+            <w:tcMar>
+              <w:top w:w="90" w:type="dxa"/>
+              <w:left w:w="150" w:type="dxa"/>
+              <w:bottom w:w="90" w:type="dxa"/>
+              <w:right w:w="150" w:type="dxa"/>
+            </w:tcMar>
+          </w:tcPr>
+          <w:p>
+            <w:r>
+              <w:rPr>
+                <w:b/>
+                <w:bCs/>
+                <w:color w:val="1A3A6B"/>
+              </w:rPr>
+              <w:t>CSS3</w:t>
+            </w:r>
+          </w:p>
+        </w:tc>
+        <w:tc>
+          <w:tcPr>
+            <w:tcW w:w="4916" w:type="dxa"/>
+            <w:tcBorders>
+              <w:top w:val="single" w:sz="1" w:space="0" w:color="A0C8E0"/>
+              <w:left w:val="single" w:sz="1" w:space="0" w:color="A0C8E0"/>
+              <w:bottom w:val="single" w:sz="1" w:space="0" w:color="A0C8E0"/>
+              <w:right w:val="single" w:sz="1" w:space="0" w:color="A0C8E0"/>
+            </w:tcBorders>
+            <w:shd w:val="clear" w:color="auto" w:fill="FFFFFF"/>
+            <w:tcMar>
+              <w:top w:w="90" w:type="dxa"/>
+              <w:left w:w="150" w:type="dxa"/>
+              <w:bottom w:w="90" w:type="dxa"/>
+              <w:right w:w="150" w:type="dxa"/>
+            </w:tcMar>
+          </w:tcPr>
+          <w:p>
+            <w:pPr>
+              <w:rPr>
+                <w:color w:val="0D2459"/>
+              </w:rPr>
+            </w:pPr>
+            <w:r>
+              <w:rPr>
+                <w:color w:val="0D2459"/>
+              </w:rPr>
+              <w:t>Stile grafico e temi personalizzabili</w:t>
+            </w:r>
+          </w:p>
+        </w:tc>
+      </w:tr>
+      <w:tr>
+        <w:tc>
+          <w:tcPr>
+            <w:tcW w:w="4110" w:type="dxa"/>
+            <w:tcBorders>
+              <w:top w:val="single" w:sz="1" w:space="0" w:color="A0C8E0"/>
+              <w:left w:val="single" w:sz="1" w:space="0" w:color="A0C8E0"/>
+              <w:bottom w:val="single" w:sz="1" w:space="0" w:color="A0C8E0"/>
+              <w:right w:val="single" w:sz="1" w:space="0" w:color="A0C8E0"/>
+            </w:tcBorders>
+            <w:shd w:val="clear" w:color="auto" w:fill="D4F5EE"/>
+            <w:tcMar>
+              <w:top w:w="90" w:type="dxa"/>
+              <w:left w:w="150" w:type="dxa"/>
+              <w:bottom w:w="90" w:type="dxa"/>
+              <w:right w:w="150" w:type="dxa"/>
+            </w:tcMar>
+          </w:tcPr>
+          <w:p>
+            <w:r>
+              <w:rPr>
+                <w:b/>
+                <w:bCs/>
+                <w:color w:val="1A3A6B"/>
+              </w:rPr>
+              <w:t>Bootstrap</w:t>
+            </w:r>
+          </w:p>
+        </w:tc>
+        <w:tc>
+          <w:tcPr>
+            <w:tcW w:w="4916" w:type="dxa"/>
+            <w:tcBorders>
+              <w:top w:val="single" w:sz="1" w:space="0" w:color="A0C8E0"/>
+              <w:left w:val="single" w:sz="1" w:space="0" w:color="A0C8E0"/>
+              <w:bottom w:val="single" w:sz="1" w:space="0" w:color="A0C8E0"/>
+              <w:right w:val="single" w:sz="1" w:space="0" w:color="A0C8E0"/>
+            </w:tcBorders>
+            <w:shd w:val="clear" w:color="auto" w:fill="D4F5EE"/>
+            <w:tcMar>
+              <w:top w:w="90" w:type="dxa"/>
+              <w:left w:w="150" w:type="dxa"/>
+              <w:bottom w:w="90" w:type="dxa"/>
+              <w:right w:w="150" w:type="dxa"/>
+            </w:tcMar>
+          </w:tcPr>
+          <w:p>
+            <w:pPr>
+              <w:rPr>
+                <w:color w:val="0D2459"/>
+              </w:rPr>
+            </w:pPr>
+            <w:r>
+              <w:rPr>
+                <w:color w:val="0D2459"/>
+              </w:rPr>
+              <w:t xml:space="preserve">Sviluppo rapido e layout </w:t>
+            </w:r>
+            <w:r>
+              <w:rPr>
+                <w:color w:val="0D2459"/>
+              </w:rPr>
+              <w:t>responsive</w:t>
+            </w:r>
+          </w:p>
+        </w:tc>
+      </w:tr>
+      <w:tr>
+        <w:tc>
+          <w:tcPr>
+            <w:tcW w:w="4110" w:type="dxa"/>
+            <w:tcBorders>
+              <w:top w:val="single" w:sz="1" w:space="0" w:color="A0C8E0"/>
+              <w:left w:val="single" w:sz="1" w:space="0" w:color="A0C8E0"/>
+              <w:bottom w:val="single" w:sz="1" w:space="0" w:color="A0C8E0"/>
+              <w:right w:val="single" w:sz="1" w:space="0" w:color="A0C8E0"/>
+            </w:tcBorders>
+            <w:shd w:val="clear" w:color="auto" w:fill="FFFFFF"/>
+            <w:tcMar>
+              <w:top w:w="90" w:type="dxa"/>
+              <w:left w:w="150" w:type="dxa"/>
+              <w:bottom w:w="90" w:type="dxa"/>
+              <w:right w:w="150" w:type="dxa"/>
+            </w:tcMar>
+          </w:tcPr>
+          <w:p>
+            <w:r>
+              <w:rPr>
+                <w:b/>
+                <w:bCs/>
+                <w:color w:val="1A3A6B"/>
+              </w:rPr>
+              <w:t>JavaScript ES6+ (Vanilla JS)</w:t>
+            </w:r>
+          </w:p>
+        </w:tc>
+        <w:tc>
+          <w:tcPr>
+            <w:tcW w:w="4916" w:type="dxa"/>
+            <w:tcBorders>
+              <w:top w:val="single" w:sz="1" w:space="0" w:color="A0C8E0"/>
+              <w:left w:val="single" w:sz="1" w:space="0" w:color="A0C8E0"/>
+              <w:bottom w:val="single" w:sz="1" w:space="0" w:color="A0C8E0"/>
+              <w:right w:val="single" w:sz="1" w:space="0" w:color="A0C8E0"/>
+            </w:tcBorders>
+            <w:shd w:val="clear" w:color="auto" w:fill="FFFFFF"/>
+            <w:tcMar>
+              <w:top w:w="90" w:type="dxa"/>
+              <w:left w:w="150" w:type="dxa"/>
+              <w:bottom w:w="90" w:type="dxa"/>
+              <w:right w:w="150" w:type="dxa"/>
+            </w:tcMar>
+          </w:tcPr>
+          <w:p>
+            <w:pPr>
+              <w:rPr>
+                <w:color w:val="0D2459"/>
+              </w:rPr>
+            </w:pPr>
+            <w:r>
+              <w:rPr>
+                <w:color w:val="0D2459"/>
+              </w:rPr>
+              <w:t>Logica applicativa e gestione</w:t>
+            </w:r>
+            <w:r>
+              <w:rPr>
+                <w:color w:val="0D2459"/>
+              </w:rPr>
+              <w:t xml:space="preserve"> </w:t>
+            </w:r>
+            <w:r>
+              <w:rPr>
+                <w:color w:val="0D2459"/>
+              </w:rPr>
+              <w:t>del DOM</w:t>
+            </w:r>
+          </w:p>
+        </w:tc>
+      </w:tr>
+      <w:tr>
+        <w:tc>
+          <w:tcPr>
+            <w:tcW w:w="4110" w:type="dxa"/>
+            <w:tcBorders>
+              <w:top w:val="single" w:sz="1" w:space="0" w:color="A0C8E0"/>
+              <w:left w:val="single" w:sz="1" w:space="0" w:color="A0C8E0"/>
+              <w:bottom w:val="single" w:sz="1" w:space="0" w:color="A0C8E0"/>
+              <w:right w:val="single" w:sz="1" w:space="0" w:color="A0C8E0"/>
+            </w:tcBorders>
+            <w:shd w:val="clear" w:color="auto" w:fill="D4F5EE"/>
+            <w:tcMar>
+              <w:top w:w="90" w:type="dxa"/>
+              <w:left w:w="150" w:type="dxa"/>
+              <w:bottom w:w="90" w:type="dxa"/>
+              <w:right w:w="150" w:type="dxa"/>
+            </w:tcMar>
+          </w:tcPr>
+          <w:p>
+            <w:r>
+              <w:rPr>
+                <w:b/>
+                <w:bCs/>
+                <w:color w:val="1A3A6B"/>
+              </w:rPr>
+              <w:t>Electron + Electron Forge</w:t>
+            </w:r>
+          </w:p>
+        </w:tc>
+        <w:tc>
+          <w:tcPr>
+            <w:tcW w:w="4916" w:type="dxa"/>
+            <w:tcBorders>
+              <w:top w:val="single" w:sz="1" w:space="0" w:color="A0C8E0"/>
+              <w:left w:val="single" w:sz="1" w:space="0" w:color="A0C8E0"/>
+              <w:bottom w:val="single" w:sz="1" w:space="0" w:color="A0C8E0"/>
+              <w:right w:val="single" w:sz="1" w:space="0" w:color="A0C8E0"/>
+            </w:tcBorders>
+            <w:shd w:val="clear" w:color="auto" w:fill="D4F5EE"/>
+            <w:tcMar>
+              <w:top w:w="90" w:type="dxa"/>
+              <w:left w:w="150" w:type="dxa"/>
+              <w:bottom w:w="90" w:type="dxa"/>
+              <w:right w:w="150" w:type="dxa"/>
+            </w:tcMar>
+          </w:tcPr>
+          <w:p>
+            <w:pPr>
+              <w:rPr>
+                <w:color w:val="0D2459"/>
+              </w:rPr>
+            </w:pPr>
+            <w:r>
+              <w:rPr>
+                <w:color w:val="0D2459"/>
+              </w:rPr>
+              <w:t>Applicazione</w:t>
+            </w:r>
+            <w:r>
+              <w:rPr>
+                <w:color w:val="0D2459"/>
+              </w:rPr>
+              <w:t xml:space="preserve"> desktop eseguibile</w:t>
+            </w:r>
+          </w:p>
+        </w:tc>
+      </w:tr>
+      <w:tr>
+        <w:tc>
+          <w:tcPr>
+            <w:tcW w:w="4110" w:type="dxa"/>
+            <w:tcBorders>
+              <w:top w:val="single" w:sz="1" w:space="0" w:color="A0C8E0"/>
+              <w:left w:val="single" w:sz="1" w:space="0" w:color="A0C8E0"/>
+              <w:bottom w:val="single" w:sz="1" w:space="0" w:color="A0C8E0"/>
+              <w:right w:val="single" w:sz="1" w:space="0" w:color="A0C8E0"/>
+            </w:tcBorders>
+            <w:shd w:val="clear" w:color="auto" w:fill="FFFFFF"/>
+            <w:tcMar>
+              <w:top w:w="90" w:type="dxa"/>
+              <w:left w:w="150" w:type="dxa"/>
+              <w:bottom w:w="90" w:type="dxa"/>
+              <w:right w:w="150" w:type="dxa"/>
+            </w:tcMar>
+          </w:tcPr>
+          <w:p>
+            <w:r>
+              <w:rPr>
+                <w:b/>
+                <w:bCs/>
+                <w:color w:val="1A3A6B"/>
+              </w:rPr>
+              <w:t>File JSON</w:t>
+            </w:r>
+          </w:p>
+        </w:tc>
+        <w:tc>
+          <w:tcPr>
+            <w:tcW w:w="4916" w:type="dxa"/>
+            <w:tcBorders>
+              <w:top w:val="single" w:sz="1" w:space="0" w:color="A0C8E0"/>
+              <w:left w:val="single" w:sz="1" w:space="0" w:color="A0C8E0"/>
+              <w:bottom w:val="single" w:sz="1" w:space="0" w:color="A0C8E0"/>
+              <w:right w:val="single" w:sz="1" w:space="0" w:color="A0C8E0"/>
+            </w:tcBorders>
+            <w:shd w:val="clear" w:color="auto" w:fill="FFFFFF"/>
+            <w:tcMar>
+              <w:top w:w="90" w:type="dxa"/>
+              <w:left w:w="150" w:type="dxa"/>
+              <w:bottom w:w="90" w:type="dxa"/>
+              <w:right w:w="150" w:type="dxa"/>
+            </w:tcMar>
+          </w:tcPr>
+          <w:p>
+            <w:pPr>
+              <w:rPr>
+                <w:color w:val="0D2459"/>
+              </w:rPr>
+            </w:pPr>
+            <w:proofErr w:type="spellStart"/>
+            <w:r>
+              <w:rPr>
+                <w:color w:val="0D2459"/>
+              </w:rPr>
+              <w:t>Serializzazione</w:t>
+            </w:r>
+            <w:proofErr w:type="spellEnd"/>
+            <w:r>
+              <w:rPr>
+                <w:color w:val="0D2459"/>
+              </w:rPr>
+              <w:t xml:space="preserve"> e </w:t>
+            </w:r>
+            <w:proofErr w:type="spellStart"/>
+            <w:r>
+              <w:rPr>
+                <w:color w:val="0D2459"/>
+              </w:rPr>
+              <w:t>scambio</w:t>
+            </w:r>
+            <w:proofErr w:type="spellEnd"/>
+            <w:r>
+              <w:rPr>
+                <w:color w:val="0D2459"/>
+              </w:rPr>
+              <w:t xml:space="preserve"> </w:t>
+            </w:r>
+            <w:proofErr w:type="spellStart"/>
+            <w:r>
+              <w:rPr>
+                <w:color w:val="0D2459"/>
+              </w:rPr>
+              <w:t>dati</w:t>
+            </w:r>
+            <w:proofErr w:type="spellEnd"/>
+          </w:p>
+        </w:tc>
+      </w:tr>
+      <w:tr>
+        <w:tc>
+          <w:tcPr>
+            <w:tcW w:w="4110" w:type="dxa"/>
+            <w:tcBorders>
+              <w:top w:val="single" w:sz="1" w:space="0" w:color="A0C8E0"/>
+              <w:left w:val="single" w:sz="1" w:space="0" w:color="A0C8E0"/>
+              <w:bottom w:val="single" w:sz="1" w:space="0" w:color="A0C8E0"/>
+              <w:right w:val="single" w:sz="1" w:space="0" w:color="A0C8E0"/>
+            </w:tcBorders>
+            <w:shd w:val="clear" w:color="auto" w:fill="D4F5EE"/>
+            <w:tcMar>
+              <w:top w:w="90" w:type="dxa"/>
+              <w:left w:w="150" w:type="dxa"/>
+              <w:bottom w:w="90" w:type="dxa"/>
+              <w:right w:w="150" w:type="dxa"/>
+            </w:tcMar>
+          </w:tcPr>
+          <w:p>
+            <w:r>
+              <w:rPr>
+                <w:b/>
+                <w:bCs/>
+                <w:color w:val="1A3A6B"/>
+              </w:rPr>
+              <w:t>File System Access API</w:t>
+            </w:r>
+          </w:p>
+        </w:tc>
+        <w:tc>
+          <w:tcPr>
+            <w:tcW w:w="4916" w:type="dxa"/>
+            <w:tcBorders>
+              <w:top w:val="single" w:sz="1" w:space="0" w:color="A0C8E0"/>
+              <w:left w:val="single" w:sz="1" w:space="0" w:color="A0C8E0"/>
+              <w:bottom w:val="single" w:sz="1" w:space="0" w:color="A0C8E0"/>
+              <w:right w:val="single" w:sz="1" w:space="0" w:color="A0C8E0"/>
+            </w:tcBorders>
+            <w:shd w:val="clear" w:color="auto" w:fill="D4F5EE"/>
+            <w:tcMar>
+              <w:top w:w="90" w:type="dxa"/>
+              <w:left w:w="150" w:type="dxa"/>
+              <w:bottom w:w="90" w:type="dxa"/>
+              <w:right w:w="150" w:type="dxa"/>
+            </w:tcMar>
+          </w:tcPr>
+          <w:p>
+            <w:pPr>
+              <w:rPr>
+                <w:color w:val="0D2459"/>
+              </w:rPr>
+            </w:pPr>
+            <w:r>
+              <w:rPr>
+                <w:color w:val="0D2459"/>
+              </w:rPr>
+              <w:t>Salvataggio diretto sul filesystem locale</w:t>
+            </w:r>
+          </w:p>
+        </w:tc>
+      </w:tr>
+      <w:tr>
+        <w:tc>
+          <w:tcPr>
+            <w:tcW w:w="4110" w:type="dxa"/>
+            <w:tcBorders>
+              <w:top w:val="single" w:sz="1" w:space="0" w:color="A0C8E0"/>
+              <w:left w:val="single" w:sz="1" w:space="0" w:color="A0C8E0"/>
+              <w:bottom w:val="single" w:sz="1" w:space="0" w:color="A0C8E0"/>
+              <w:right w:val="single" w:sz="1" w:space="0" w:color="A0C8E0"/>
+            </w:tcBorders>
+            <w:shd w:val="clear" w:color="auto" w:fill="FFFFFF"/>
+            <w:tcMar>
+              <w:top w:w="90" w:type="dxa"/>
+              <w:left w:w="150" w:type="dxa"/>
+              <w:bottom w:w="90" w:type="dxa"/>
+              <w:right w:w="150" w:type="dxa"/>
+            </w:tcMar>
+          </w:tcPr>
+          <w:p>
+            <w:r>
+              <w:rPr>
+                <w:b/>
+                <w:bCs/>
+                <w:color w:val="1A3A6B"/>
+              </w:rPr>
+              <w:t>LocalStorage</w:t>
+            </w:r>
+          </w:p>
+        </w:tc>
+        <w:tc>
+          <w:tcPr>
+            <w:tcW w:w="4916" w:type="dxa"/>
+            <w:tcBorders>
+              <w:top w:val="single" w:sz="1" w:space="0" w:color="A0C8E0"/>
+              <w:left w:val="single" w:sz="1" w:space="0" w:color="A0C8E0"/>
+              <w:bottom w:val="single" w:sz="1" w:space="0" w:color="A0C8E0"/>
+              <w:right w:val="single" w:sz="1" w:space="0" w:color="A0C8E0"/>
+            </w:tcBorders>
+            <w:shd w:val="clear" w:color="auto" w:fill="FFFFFF"/>
+            <w:tcMar>
+              <w:top w:w="90" w:type="dxa"/>
+              <w:left w:w="150" w:type="dxa"/>
+              <w:bottom w:w="90" w:type="dxa"/>
+              <w:right w:w="150" w:type="dxa"/>
+            </w:tcMar>
+          </w:tcPr>
+          <w:p>
+            <w:pPr>
+              <w:rPr>
+                <w:color w:val="0D2459"/>
+              </w:rPr>
+            </w:pPr>
+            <w:r>
+              <w:rPr>
+                <w:color w:val="0D2459"/>
+              </w:rPr>
+              <w:t>Backup automatico e persistenza locale</w:t>
+            </w:r>
+          </w:p>
+        </w:tc>
+      </w:tr>
+      <w:tr>
+        <w:tc>
+          <w:tcPr>
+            <w:tcW w:w="4110" w:type="dxa"/>
+            <w:tcBorders>
+              <w:top w:val="single" w:sz="1" w:space="0" w:color="A0C8E0"/>
+              <w:left w:val="single" w:sz="1" w:space="0" w:color="A0C8E0"/>
+              <w:bottom w:val="single" w:sz="1" w:space="0" w:color="A0C8E0"/>
+              <w:right w:val="single" w:sz="1" w:space="0" w:color="A0C8E0"/>
+            </w:tcBorders>
+            <w:shd w:val="clear" w:color="auto" w:fill="D4F5EE"/>
+            <w:tcMar>
+              <w:top w:w="90" w:type="dxa"/>
+              <w:left w:w="150" w:type="dxa"/>
+              <w:bottom w:w="90" w:type="dxa"/>
+              <w:right w:w="150" w:type="dxa"/>
+            </w:tcMar>
+          </w:tcPr>
+          <w:p>
+            <w:r>
+              <w:rPr>
+                <w:b/>
+                <w:bCs/>
+                <w:color w:val="1A3A6B"/>
+              </w:rPr>
+              <w:t>Python</w:t>
+            </w:r>
+          </w:p>
+        </w:tc>
+        <w:tc>
+          <w:tcPr>
+            <w:tcW w:w="4916" w:type="dxa"/>
+            <w:tcBorders>
+              <w:top w:val="single" w:sz="1" w:space="0" w:color="A0C8E0"/>
+              <w:left w:val="single" w:sz="1" w:space="0" w:color="A0C8E0"/>
+              <w:bottom w:val="single" w:sz="1" w:space="0" w:color="A0C8E0"/>
+              <w:right w:val="single" w:sz="1" w:space="0" w:color="A0C8E0"/>
+            </w:tcBorders>
+            <w:shd w:val="clear" w:color="auto" w:fill="D4F5EE"/>
+            <w:tcMar>
+              <w:top w:w="90" w:type="dxa"/>
+              <w:left w:w="150" w:type="dxa"/>
+              <w:bottom w:w="90" w:type="dxa"/>
+              <w:right w:w="150" w:type="dxa"/>
+            </w:tcMar>
+          </w:tcPr>
+          <w:p>
+            <w:pPr>
+              <w:rPr>
+                <w:color w:val="0D2459"/>
+              </w:rPr>
+            </w:pPr>
+            <w:r>
+              <w:rPr>
+                <w:color w:val="0D2459"/>
+              </w:rPr>
+              <w:t>Sviluppo del server multiplayer</w:t>
+            </w:r>
+          </w:p>
+        </w:tc>
+      </w:tr>
+      <w:tr>
+        <w:tc>
+          <w:tcPr>
+            <w:tcW w:w="4110" w:type="dxa"/>
+            <w:tcBorders>
+              <w:top w:val="single" w:sz="1" w:space="0" w:color="A0C8E0"/>
+              <w:left w:val="single" w:sz="1" w:space="0" w:color="A0C8E0"/>
+              <w:bottom w:val="single" w:sz="1" w:space="0" w:color="A0C8E0"/>
+              <w:right w:val="single" w:sz="1" w:space="0" w:color="A0C8E0"/>
+            </w:tcBorders>
+            <w:shd w:val="clear" w:color="auto" w:fill="FFFFFF"/>
+            <w:tcMar>
+              <w:top w:w="90" w:type="dxa"/>
+              <w:left w:w="150" w:type="dxa"/>
+              <w:bottom w:w="90" w:type="dxa"/>
+              <w:right w:w="150" w:type="dxa"/>
+            </w:tcMar>
+          </w:tcPr>
+          <w:p>
+            <w:r>
+              <w:rPr>
+                <w:b/>
+                <w:bCs/>
+                <w:color w:val="1A3A6B"/>
+              </w:rPr>
+              <w:t>Asyncio</w:t>
+            </w:r>
+          </w:p>
+        </w:tc>
+        <w:tc>
+          <w:tcPr>
+            <w:tcW w:w="4916" w:type="dxa"/>
+            <w:tcBorders>
+              <w:top w:val="single" w:sz="1" w:space="0" w:color="A0C8E0"/>
+              <w:left w:val="single" w:sz="1" w:space="0" w:color="A0C8E0"/>
+              <w:bottom w:val="single" w:sz="1" w:space="0" w:color="A0C8E0"/>
+              <w:right w:val="single" w:sz="1" w:space="0" w:color="A0C8E0"/>
+            </w:tcBorders>
+            <w:shd w:val="clear" w:color="auto" w:fill="FFFFFF"/>
+            <w:tcMar>
+              <w:top w:w="90" w:type="dxa"/>
+              <w:left w:w="150" w:type="dxa"/>
+              <w:bottom w:w="90" w:type="dxa"/>
+              <w:right w:w="150" w:type="dxa"/>
+            </w:tcMar>
+          </w:tcPr>
+          <w:p>
+            <w:pPr>
+              <w:rPr>
+                <w:color w:val="0D2459"/>
+              </w:rPr>
+            </w:pPr>
+            <w:r>
+              <w:rPr>
+                <w:color w:val="0D2459"/>
+              </w:rPr>
+              <w:t>Gestione asincrona delle connessioni</w:t>
+            </w:r>
+          </w:p>
+        </w:tc>
+      </w:tr>
+      <w:tr>
+        <w:tc>
+          <w:tcPr>
+            <w:tcW w:w="4110" w:type="dxa"/>
+            <w:tcBorders>
+              <w:top w:val="single" w:sz="1" w:space="0" w:color="A0C8E0"/>
+              <w:left w:val="single" w:sz="1" w:space="0" w:color="A0C8E0"/>
+              <w:bottom w:val="single" w:sz="1" w:space="0" w:color="A0C8E0"/>
+              <w:right w:val="single" w:sz="1" w:space="0" w:color="A0C8E0"/>
+            </w:tcBorders>
+            <w:shd w:val="clear" w:color="auto" w:fill="D4F5EE"/>
+            <w:tcMar>
+              <w:top w:w="90" w:type="dxa"/>
+              <w:left w:w="150" w:type="dxa"/>
+              <w:bottom w:w="90" w:type="dxa"/>
+              <w:right w:w="150" w:type="dxa"/>
+            </w:tcMar>
+          </w:tcPr>
+          <w:p>
+            <w:r>
+              <w:rPr>
+                <w:b/>
+                <w:bCs/>
+                <w:color w:val="1A3A6B"/>
+              </w:rPr>
+              <w:t>WebSocket + WebSockets (Python)</w:t>
+            </w:r>
+          </w:p>
+        </w:tc>
+        <w:tc>
+          <w:tcPr>
+            <w:tcW w:w="4916" w:type="dxa"/>
+            <w:tcBorders>
+              <w:top w:val="single" w:sz="1" w:space="0" w:color="A0C8E0"/>
+              <w:left w:val="single" w:sz="1" w:space="0" w:color="A0C8E0"/>
+              <w:bottom w:val="single" w:sz="1" w:space="0" w:color="A0C8E0"/>
+              <w:right w:val="single" w:sz="1" w:space="0" w:color="A0C8E0"/>
+            </w:tcBorders>
+            <w:shd w:val="clear" w:color="auto" w:fill="D4F5EE"/>
+            <w:tcMar>
+              <w:top w:w="90" w:type="dxa"/>
+              <w:left w:w="150" w:type="dxa"/>
+              <w:bottom w:w="90" w:type="dxa"/>
+              <w:right w:w="150" w:type="dxa"/>
+            </w:tcMar>
+          </w:tcPr>
+          <w:p>
+            <w:pPr>
+              <w:rPr>
+                <w:color w:val="0D2459"/>
+              </w:rPr>
+            </w:pPr>
+            <w:r>
+              <w:rPr>
+                <w:color w:val="0D2459"/>
+              </w:rPr>
+              <w:t>Comunicazione multiplayer in tempo reale</w:t>
+            </w:r>
+          </w:p>
+        </w:tc>
+      </w:tr>
+      <w:tr>
+        <w:tc>
+          <w:tcPr>
+            <w:tcW w:w="4110" w:type="dxa"/>
+            <w:tcBorders>
+              <w:top w:val="single" w:sz="1" w:space="0" w:color="A0C8E0"/>
+              <w:left w:val="single" w:sz="1" w:space="0" w:color="A0C8E0"/>
+              <w:bottom w:val="single" w:sz="1" w:space="0" w:color="A0C8E0"/>
+              <w:right w:val="single" w:sz="1" w:space="0" w:color="A0C8E0"/>
+            </w:tcBorders>
+            <w:tcMar>
+              <w:top w:w="90" w:type="dxa"/>
+              <w:left w:w="150" w:type="dxa"/>
+              <w:bottom w:w="90" w:type="dxa"/>
+              <w:right w:w="150" w:type="dxa"/>
+            </w:tcMar>
+          </w:tcPr>
+          <w:p>
+            <w:pPr>
+              <w:rPr>
+                <w:b/>
+                <w:bCs/>
+                <w:color w:val="1A3A6B"/>
+              </w:rPr>
+            </w:pPr>
+            <w:r>
+              <w:rPr>
+                <w:b/>
+                <w:bCs/>
+                <w:color w:val="1A3A6B"/>
+              </w:rPr>
+              <w:t>Git</w:t>
+            </w:r>
+          </w:p>
+        </w:tc>
+        <w:tc>
+          <w:tcPr>
+            <w:tcW w:w="4916" w:type="dxa"/>
+            <w:tcBorders>
+              <w:top w:val="single" w:sz="1" w:space="0" w:color="A0C8E0"/>
+              <w:left w:val="single" w:sz="1" w:space="0" w:color="A0C8E0"/>
+              <w:bottom w:val="single" w:sz="1" w:space="0" w:color="A0C8E0"/>
+              <w:right w:val="single" w:sz="1" w:space="0" w:color="A0C8E0"/>
+            </w:tcBorders>
+            <w:tcMar>
+              <w:top w:w="90" w:type="dxa"/>
+              <w:left w:w="150" w:type="dxa"/>
+              <w:bottom w:w="90" w:type="dxa"/>
+              <w:right w:w="150" w:type="dxa"/>
+            </w:tcMar>
+          </w:tcPr>
+          <w:p>
+            <w:pPr>
+              <w:rPr>
+                <w:color w:val="0D2459"/>
+              </w:rPr>
+            </w:pPr>
+            <w:r>
+              <w:rPr>
+                <w:color w:val="0D2459"/>
+              </w:rPr>
+              <w:t xml:space="preserve">Controllo versione e </w:t>
+            </w:r>
+            <w:r>
+              <w:rPr>
+                <w:color w:val="0D2459"/>
+              </w:rPr>
+              <w:t>gestione sviluppo</w:t>
+            </w:r>
+          </w:p>
+        </w:tc>
+      </w:tr>
+      <w:tr>
+        <w:tc>
+          <w:tcPr>
+            <w:tcW w:w="4110" w:type="dxa"/>
+            <w:tcBorders>
+              <w:top w:val="single" w:sz="1" w:space="0" w:color="A0C8E0"/>
+              <w:left w:val="single" w:sz="1" w:space="0" w:color="A0C8E0"/>
+              <w:bottom w:val="single" w:sz="1" w:space="0" w:color="A0C8E0"/>
+              <w:right w:val="single" w:sz="1" w:space="0" w:color="A0C8E0"/>
+            </w:tcBorders>
+            <w:shd w:val="clear" w:color="auto" w:fill="D4F5EE"/>
+            <w:tcMar>
+              <w:top w:w="90" w:type="dxa"/>
+              <w:left w:w="150" w:type="dxa"/>
+              <w:bottom w:w="90" w:type="dxa"/>
+              <w:right w:w="150" w:type="dxa"/>
+            </w:tcMar>
+          </w:tcPr>
+          <w:p>
+            <w:pPr>
+              <w:rPr>
+                <w:b/>
+                <w:bCs/>
+                <w:color w:val="1A3A6B"/>
+              </w:rPr>
+            </w:pPr>
+            <w:r>
+              <w:rPr>
+                <w:b/>
+                <w:bCs/>
+                <w:color w:val="1A3A6B"/>
+              </w:rPr>
+              <w:t>Architettura offline-first</w:t>
+            </w:r>
+          </w:p>
+        </w:tc>
+        <w:tc>
+          <w:tcPr>
+            <w:tcW w:w="4916" w:type="dxa"/>
+            <w:tcBorders>
+              <w:top w:val="single" w:sz="1" w:space="0" w:color="A0C8E0"/>
+              <w:left w:val="single" w:sz="1" w:space="0" w:color="A0C8E0"/>
+              <w:bottom w:val="single" w:sz="1" w:space="0" w:color="A0C8E0"/>
+              <w:right w:val="single" w:sz="1" w:space="0" w:color="A0C8E0"/>
+            </w:tcBorders>
+            <w:shd w:val="clear" w:color="auto" w:fill="D4F5EE"/>
+            <w:tcMar>
+              <w:top w:w="90" w:type="dxa"/>
+              <w:left w:w="150" w:type="dxa"/>
+              <w:bottom w:w="90" w:type="dxa"/>
+              <w:right w:w="150" w:type="dxa"/>
+            </w:tcMar>
+          </w:tcPr>
+          <w:p>
+            <w:pPr>
+              <w:rPr>
+                <w:color w:val="0D2459"/>
+              </w:rPr>
+            </w:pPr>
+            <w:r>
+              <w:rPr>
+                <w:color w:val="0D2459"/>
+              </w:rPr>
+              <w:t xml:space="preserve">Privacy, indipendenza </w:t>
+            </w:r>
+            <w:r>
+              <w:rPr>
+                <w:color w:val="0D2459"/>
+              </w:rPr>
+              <w:t xml:space="preserve">dal </w:t>
+            </w:r>
+            <w:r>
+              <w:rPr>
+                <w:color w:val="0D2459"/>
+              </w:rPr>
+              <w:t xml:space="preserve">cloud e </w:t>
+            </w:r>
+            <w:r>
+              <w:rPr>
+                <w:color w:val="0D2459"/>
+              </w:rPr>
+              <w:t>uso</w:t>
+            </w:r>
+            <w:r>
+              <w:rPr>
+                <w:color w:val="0D2459"/>
+              </w:rPr>
+              <w:t xml:space="preserve"> offline</w:t>
+            </w:r>
+          </w:p>
+        </w:tc>
+      </w:tr>
+    </w:tbl>
     <w:p>
       <w:pPr>
         <w:pStyle w:val="Titolo1"/>
@@ -3078,6 +4047,17 @@
     </w:p>
     <w:p>
       <w:pPr>
+        <w:pStyle w:val="Titolo2"/>
+      </w:pPr>
+      <w:r>
+        <w:rPr>
+          <w:color w:val="0077FF"/>
+        </w:rPr>
+        <w:t>7.1 Possibili Sviluppi Futuri</w:t>
+      </w:r>
+    </w:p>
+    <w:p>
+      <w:pPr>
         <w:spacing w:after="140"/>
         <w:jc w:val="both"/>
       </w:pPr>
@@ -3086,6 +4066,18 @@
           <w:color w:val="0D2459"/>
         </w:rPr>
         <w:t>Guardando avanti, gli sviluppi più interessanti che si potrebbero esplorare includono la condivisione in tempo reale della scheda del personaggio e delle relative statistiche tra tutti i giocatori del party, il supporto a sistemi di gioco diversi da D&amp;D 5e — come “Seventh Sea” oppure “Sì, Oscuro Signore” —, e la possibilità di ospitare il server su Internet tramite tunnel sicuro per permettere sessioni di gioco a distanza.</w:t>
+      </w:r>
+    </w:p>
+    <w:p>
+      <w:pPr>
+        <w:spacing w:after="140"/>
+        <w:jc w:val="both"/>
+      </w:pPr>
+      <w:r>
+        <w:rPr>
+          <w:color w:val="0D2459"/>
+        </w:rPr>
+        <w:t>Una delle evoluzioni più significative riguarderebbe il passaggio da un modello puramente locale a un sistema con autenticazione utente e persistenza remota delle schede. Attualmente ogni scheda viene salvata come file JSON sul filesystem locale dell’utente, una scelta coerente con la natura offline-first del progetto. Tuttavia, questa struttura si presta naturalmente a una migrazione verso MongoDB: essendo un database documentale che archivia i dati in formato BSON — strutturalmente analogo a JSON — ogni scheda potrebbe essere salvata come documento nella propria collezione senza richiedere modifiche alla struttura dati esistente. Un sistema di login permetterebbe a ciascun utente di accedere alle proprie schede da qualsiasi dispositivo, sincronizzare automaticamente le modifiche durante la sessione e condividere la scheda in sola lettura con gli altri giocatori del party. Il server Python attuale potrebbe essere esteso con un layer REST o GraphQL per gestire l’autenticazione tramite JWT e le operazioni CRUD sulle schede, mantenendo inalterato il modulo WebSocket già esistente per la chat in tempo reale.</w:t>
       </w:r>
     </w:p>
     <w:p>
@@ -3861,7 +4853,6 @@
   <w:style w:type="character" w:default="1" w:styleId="Carpredefinitoparagrafo">
     <w:name w:val="Default Paragraph Font"/>
     <w:uiPriority w:val="1"/>
-    <w:semiHidden/>
     <w:unhideWhenUsed/>
   </w:style>
   <w:style w:type="table" w:default="1" w:styleId="Tabellanormale">

</xml_diff>

<commit_message>
Added sources to the thesis
</commit_message>
<xml_diff>
--- a/documents/tesina.docx
+++ b/documents/tesina.docx
@@ -2359,12 +2359,29 @@
             </w:tcMar>
           </w:tcPr>
           <w:p>
-            <w:r>
-              <w:rPr>
-                <w:color w:val="0D2459"/>
-              </w:rPr>
-              <w:t>HTML5</w:t>
-            </w:r>
+            <w:hyperlink r:id="rId13" w:history="1">
+              <w:r>
+                <w:rPr>
+                  <w:color w:val="0D2459"/>
+                  <w:u w:val="single"/>
+                </w:rPr>
+                <w:t>H</w:t>
+              </w:r>
+              <w:r>
+                <w:rPr>
+                  <w:color w:val="0D2459"/>
+                  <w:u w:val="single"/>
+                </w:rPr>
+                <w:t>y</w:t>
+              </w:r>
+              <w:r>
+                <w:rPr>
+                  <w:color w:val="0D2459"/>
+                  <w:u w:val="single"/>
+                </w:rPr>
+                <w:t>TML5</w:t>
+              </w:r>
+            </w:hyperlink>
           </w:p>
         </w:tc>
       </w:tr>
@@ -2415,12 +2432,30 @@
             </w:tcMar>
           </w:tcPr>
           <w:p>
+            <w:hyperlink r:id="rId14" w:history="1">
+              <w:r>
+                <w:rPr>
+                  <w:color w:val="0D2459"/>
+                  <w:u w:val="single"/>
+                </w:rPr>
+                <w:t>CSS3</w:t>
+              </w:r>
+            </w:hyperlink>
             <w:r>
               <w:rPr>
                 <w:color w:val="0D2459"/>
               </w:rPr>
-              <w:t>CSS3, Bootstrap 5.3</w:t>
+              <w:t xml:space="preserve">, </w:t>
             </w:r>
+            <w:hyperlink r:id="rId15" w:history="1">
+              <w:r>
+                <w:rPr>
+                  <w:color w:val="0D2459"/>
+                  <w:u w:val="single"/>
+                </w:rPr>
+                <w:t>Bootstrap 5.3</w:t>
+              </w:r>
+            </w:hyperlink>
           </w:p>
         </w:tc>
       </w:tr>
@@ -2471,12 +2506,15 @@
             </w:tcMar>
           </w:tcPr>
           <w:p>
-            <w:r>
-              <w:rPr>
-                <w:color w:val="0D2459"/>
-              </w:rPr>
-              <w:t>JavaScript ES6+ (Vanilla JS)</w:t>
-            </w:r>
+            <w:hyperlink r:id="rId16" w:history="1">
+              <w:r>
+                <w:rPr>
+                  <w:color w:val="0D2459"/>
+                  <w:u w:val="single"/>
+                </w:rPr>
+                <w:t>JavaScript ES6+ (Vanilla JS)</w:t>
+              </w:r>
+            </w:hyperlink>
           </w:p>
         </w:tc>
       </w:tr>
@@ -2527,12 +2565,15 @@
             </w:tcMar>
           </w:tcPr>
           <w:p>
-            <w:r>
-              <w:rPr>
-                <w:color w:val="0D2459"/>
-              </w:rPr>
-              <w:t>Electron</w:t>
-            </w:r>
+            <w:hyperlink r:id="rId17" w:history="1">
+              <w:r>
+                <w:rPr>
+                  <w:color w:val="0D2459"/>
+                  <w:u w:val="single"/>
+                </w:rPr>
+                <w:t>Electron</w:t>
+              </w:r>
+            </w:hyperlink>
           </w:p>
         </w:tc>
       </w:tr>
@@ -2583,12 +2624,15 @@
             </w:tcMar>
           </w:tcPr>
           <w:p>
-            <w:r>
-              <w:rPr>
-                <w:color w:val="0D2459"/>
-              </w:rPr>
-              <w:t>Electron Forge</w:t>
-            </w:r>
+            <w:hyperlink r:id="rId18" w:history="1">
+              <w:r>
+                <w:rPr>
+                  <w:color w:val="0D2459"/>
+                  <w:u w:val="single"/>
+                </w:rPr>
+                <w:t>Electron Forge</w:t>
+              </w:r>
+            </w:hyperlink>
           </w:p>
         </w:tc>
       </w:tr>
@@ -2644,12 +2688,22 @@
                 <w:lang w:val="en-US"/>
               </w:rPr>
             </w:pPr>
+            <w:hyperlink r:id="rId19" w:history="1">
+              <w:r>
+                <w:rPr>
+                  <w:color w:val="0D2459"/>
+                  <w:u w:val="single"/>
+                  <w:lang w:val="en-US"/>
+                </w:rPr>
+                <w:t>File System Access API</w:t>
+              </w:r>
+            </w:hyperlink>
             <w:r>
               <w:rPr>
                 <w:color w:val="0D2459"/>
                 <w:lang w:val="en-US"/>
               </w:rPr>
-              <w:t>File System Access API / Blob download</w:t>
+              <w:t xml:space="preserve"> / Blob download</w:t>
             </w:r>
           </w:p>
         </w:tc>
@@ -2701,12 +2755,15 @@
             </w:tcMar>
           </w:tcPr>
           <w:p>
-            <w:r>
-              <w:rPr>
-                <w:color w:val="0D2459"/>
-              </w:rPr>
-              <w:t>localStorage (con salvataggio automatico)</w:t>
-            </w:r>
+            <w:hyperlink r:id="rId20" w:history="1">
+              <w:r>
+                <w:rPr>
+                  <w:color w:val="0D2459"/>
+                  <w:u w:val="single"/>
+                </w:rPr>
+                <w:t>localStorage (con salvataggio automatico)</w:t>
+              </w:r>
+            </w:hyperlink>
           </w:p>
         </w:tc>
       </w:tr>
@@ -2813,12 +2870,30 @@
             </w:tcMar>
           </w:tcPr>
           <w:p>
+            <w:hyperlink r:id="rId21" w:history="1">
+              <w:r>
+                <w:rPr>
+                  <w:color w:val="0D2459"/>
+                  <w:u w:val="single"/>
+                </w:rPr>
+                <w:t>Python 3</w:t>
+              </w:r>
+            </w:hyperlink>
             <w:r>
               <w:rPr>
                 <w:color w:val="0D2459"/>
               </w:rPr>
-              <w:t>Python 3, asyncio</w:t>
+              <w:t xml:space="preserve">, </w:t>
             </w:r>
+            <w:hyperlink r:id="rId22" w:history="1">
+              <w:r>
+                <w:rPr>
+                  <w:color w:val="0D2459"/>
+                  <w:u w:val="single"/>
+                </w:rPr>
+                <w:t>asyncio</w:t>
+              </w:r>
+            </w:hyperlink>
           </w:p>
         </w:tc>
       </w:tr>
@@ -2869,12 +2944,15 @@
             </w:tcMar>
           </w:tcPr>
           <w:p>
-            <w:r>
-              <w:rPr>
-                <w:color w:val="0D2459"/>
-              </w:rPr>
-              <w:t>WebSockets (PyPI)</w:t>
-            </w:r>
+            <w:hyperlink r:id="rId23" w:history="1">
+              <w:r>
+                <w:rPr>
+                  <w:color w:val="0D2459"/>
+                  <w:u w:val="single"/>
+                </w:rPr>
+                <w:t>WebSockets (PyPI)</w:t>
+              </w:r>
+            </w:hyperlink>
           </w:p>
         </w:tc>
       </w:tr>
@@ -2925,12 +3003,15 @@
             </w:tcMar>
           </w:tcPr>
           <w:p>
-            <w:r>
-              <w:rPr>
-                <w:color w:val="0D2459"/>
-              </w:rPr>
-              <w:t>WebSocket RFC 6455</w:t>
-            </w:r>
+            <w:hyperlink r:id="rId24" w:history="1">
+              <w:r>
+                <w:rPr>
+                  <w:color w:val="0D2459"/>
+                  <w:u w:val="single"/>
+                </w:rPr>
+                <w:t>WebSocket RFC 6455</w:t>
+              </w:r>
+            </w:hyperlink>
           </w:p>
         </w:tc>
       </w:tr>
@@ -2981,12 +3062,15 @@
             </w:tcMar>
           </w:tcPr>
           <w:p>
-            <w:r>
-              <w:rPr>
-                <w:color w:val="0D2459"/>
-              </w:rPr>
-              <w:t>Git</w:t>
-            </w:r>
+            <w:hyperlink r:id="rId25" w:history="1">
+              <w:r>
+                <w:rPr>
+                  <w:color w:val="0D2459"/>
+                  <w:u w:val="single"/>
+                </w:rPr>
+                <w:t>Git</w:t>
+              </w:r>
+            </w:hyperlink>
           </w:p>
         </w:tc>
       </w:tr>
@@ -3004,13 +3088,7 @@
         <w:rPr>
           <w:color w:val="0077FF"/>
         </w:rPr>
-        <w:t>6.1</w:t>
-      </w:r>
-      <w:r>
-        <w:rPr>
-          <w:color w:val="0077FF"/>
-        </w:rPr>
-        <w:t xml:space="preserve"> </w:t>
+        <w:t xml:space="preserve">6.1 </w:t>
       </w:r>
       <w:r>
         <w:rPr>
@@ -3123,14 +3201,17 @@
             </w:tcMar>
           </w:tcPr>
           <w:p>
-            <w:r>
-              <w:rPr>
-                <w:b/>
-                <w:bCs/>
-                <w:color w:val="1A3A6B"/>
-              </w:rPr>
-              <w:t>HTML5</w:t>
-            </w:r>
+            <w:hyperlink r:id="rId26" w:history="1">
+              <w:r>
+                <w:rPr>
+                  <w:b/>
+                  <w:bCs/>
+                  <w:color w:val="1A3A6B"/>
+                  <w:u w:val="single"/>
+                </w:rPr>
+                <w:t>HTML5</w:t>
+              </w:r>
+            </w:hyperlink>
           </w:p>
         </w:tc>
         <w:tc>
@@ -3184,14 +3265,17 @@
             </w:tcMar>
           </w:tcPr>
           <w:p>
-            <w:r>
-              <w:rPr>
-                <w:b/>
-                <w:bCs/>
-                <w:color w:val="1A3A6B"/>
-              </w:rPr>
-              <w:t>CSS3</w:t>
-            </w:r>
+            <w:hyperlink r:id="rId27" w:history="1">
+              <w:r>
+                <w:rPr>
+                  <w:b/>
+                  <w:bCs/>
+                  <w:color w:val="1A3A6B"/>
+                  <w:u w:val="single"/>
+                </w:rPr>
+                <w:t>CSS3</w:t>
+              </w:r>
+            </w:hyperlink>
           </w:p>
         </w:tc>
         <w:tc>
@@ -3245,14 +3329,17 @@
             </w:tcMar>
           </w:tcPr>
           <w:p>
-            <w:r>
-              <w:rPr>
-                <w:b/>
-                <w:bCs/>
-                <w:color w:val="1A3A6B"/>
-              </w:rPr>
-              <w:t>Bootstrap</w:t>
-            </w:r>
+            <w:hyperlink r:id="rId28" w:history="1">
+              <w:r>
+                <w:rPr>
+                  <w:b/>
+                  <w:bCs/>
+                  <w:color w:val="1A3A6B"/>
+                  <w:u w:val="single"/>
+                </w:rPr>
+                <w:t>Bootstrap</w:t>
+              </w:r>
+            </w:hyperlink>
           </w:p>
         </w:tc>
         <w:tc>
@@ -3282,13 +3369,7 @@
               <w:rPr>
                 <w:color w:val="0D2459"/>
               </w:rPr>
-              <w:t xml:space="preserve">Sviluppo rapido e layout </w:t>
-            </w:r>
-            <w:r>
-              <w:rPr>
-                <w:color w:val="0D2459"/>
-              </w:rPr>
-              <w:t>responsive</w:t>
+              <w:t>Sviluppo rapido e layout responsive</w:t>
             </w:r>
           </w:p>
         </w:tc>
@@ -3312,14 +3393,17 @@
             </w:tcMar>
           </w:tcPr>
           <w:p>
-            <w:r>
-              <w:rPr>
-                <w:b/>
-                <w:bCs/>
-                <w:color w:val="1A3A6B"/>
-              </w:rPr>
-              <w:t>JavaScript ES6+ (Vanilla JS)</w:t>
-            </w:r>
+            <w:hyperlink r:id="rId29" w:history="1">
+              <w:r>
+                <w:rPr>
+                  <w:b/>
+                  <w:bCs/>
+                  <w:color w:val="1A3A6B"/>
+                  <w:u w:val="single"/>
+                </w:rPr>
+                <w:t>JavaScript ES6+ (Vanilla JS)</w:t>
+              </w:r>
+            </w:hyperlink>
           </w:p>
         </w:tc>
         <w:tc>
@@ -3349,19 +3433,7 @@
               <w:rPr>
                 <w:color w:val="0D2459"/>
               </w:rPr>
-              <w:t>Logica applicativa e gestione</w:t>
-            </w:r>
-            <w:r>
-              <w:rPr>
-                <w:color w:val="0D2459"/>
-              </w:rPr>
-              <w:t xml:space="preserve"> </w:t>
-            </w:r>
-            <w:r>
-              <w:rPr>
-                <w:color w:val="0D2459"/>
-              </w:rPr>
-              <w:t>del DOM</w:t>
+              <w:t>Logica applicativa e gestione del DOM</w:t>
             </w:r>
           </w:p>
         </w:tc>
@@ -3385,14 +3457,36 @@
             </w:tcMar>
           </w:tcPr>
           <w:p>
+            <w:hyperlink r:id="rId30" w:history="1">
+              <w:r>
+                <w:rPr>
+                  <w:b/>
+                  <w:bCs/>
+                  <w:color w:val="1A3A6B"/>
+                  <w:u w:val="single"/>
+                </w:rPr>
+                <w:t>Electron</w:t>
+              </w:r>
+            </w:hyperlink>
             <w:r>
               <w:rPr>
                 <w:b/>
                 <w:bCs/>
                 <w:color w:val="1A3A6B"/>
               </w:rPr>
-              <w:t>Electron + Electron Forge</w:t>
+              <w:t xml:space="preserve"> + </w:t>
             </w:r>
+            <w:hyperlink r:id="rId31" w:history="1">
+              <w:r>
+                <w:rPr>
+                  <w:b/>
+                  <w:bCs/>
+                  <w:color w:val="1A3A6B"/>
+                  <w:u w:val="single"/>
+                </w:rPr>
+                <w:t>Electron Forge</w:t>
+              </w:r>
+            </w:hyperlink>
           </w:p>
         </w:tc>
         <w:tc>
@@ -3422,13 +3516,7 @@
               <w:rPr>
                 <w:color w:val="0D2459"/>
               </w:rPr>
-              <w:t>Applicazione</w:t>
-            </w:r>
-            <w:r>
-              <w:rPr>
-                <w:color w:val="0D2459"/>
-              </w:rPr>
-              <w:t xml:space="preserve"> desktop eseguibile</w:t>
+              <w:t>Applicazione desktop eseguibile</w:t>
             </w:r>
           </w:p>
         </w:tc>
@@ -3485,42 +3573,12 @@
                 <w:color w:val="0D2459"/>
               </w:rPr>
             </w:pPr>
-            <w:proofErr w:type="spellStart"/>
             <w:r>
               <w:rPr>
                 <w:color w:val="0D2459"/>
               </w:rPr>
-              <w:t>Serializzazione</w:t>
+              <w:t>Serializzazione e scambio dati</w:t>
             </w:r>
-            <w:proofErr w:type="spellEnd"/>
-            <w:r>
-              <w:rPr>
-                <w:color w:val="0D2459"/>
-              </w:rPr>
-              <w:t xml:space="preserve"> e </w:t>
-            </w:r>
-            <w:proofErr w:type="spellStart"/>
-            <w:r>
-              <w:rPr>
-                <w:color w:val="0D2459"/>
-              </w:rPr>
-              <w:t>scambio</w:t>
-            </w:r>
-            <w:proofErr w:type="spellEnd"/>
-            <w:r>
-              <w:rPr>
-                <w:color w:val="0D2459"/>
-              </w:rPr>
-              <w:t xml:space="preserve"> </w:t>
-            </w:r>
-            <w:proofErr w:type="spellStart"/>
-            <w:r>
-              <w:rPr>
-                <w:color w:val="0D2459"/>
-              </w:rPr>
-              <w:t>dati</w:t>
-            </w:r>
-            <w:proofErr w:type="spellEnd"/>
           </w:p>
         </w:tc>
       </w:tr>
@@ -3543,14 +3601,17 @@
             </w:tcMar>
           </w:tcPr>
           <w:p>
-            <w:r>
-              <w:rPr>
-                <w:b/>
-                <w:bCs/>
-                <w:color w:val="1A3A6B"/>
-              </w:rPr>
-              <w:t>File System Access API</w:t>
-            </w:r>
+            <w:hyperlink r:id="rId32" w:history="1">
+              <w:r>
+                <w:rPr>
+                  <w:b/>
+                  <w:bCs/>
+                  <w:color w:val="1A3A6B"/>
+                  <w:u w:val="single"/>
+                </w:rPr>
+                <w:t>File System Access API</w:t>
+              </w:r>
+            </w:hyperlink>
           </w:p>
         </w:tc>
         <w:tc>
@@ -3604,14 +3665,17 @@
             </w:tcMar>
           </w:tcPr>
           <w:p>
-            <w:r>
-              <w:rPr>
-                <w:b/>
-                <w:bCs/>
-                <w:color w:val="1A3A6B"/>
-              </w:rPr>
-              <w:t>LocalStorage</w:t>
-            </w:r>
+            <w:hyperlink r:id="rId33" w:history="1">
+              <w:r>
+                <w:rPr>
+                  <w:b/>
+                  <w:bCs/>
+                  <w:color w:val="1A3A6B"/>
+                  <w:u w:val="single"/>
+                </w:rPr>
+                <w:t>LocalStorage</w:t>
+              </w:r>
+            </w:hyperlink>
           </w:p>
         </w:tc>
         <w:tc>
@@ -3665,14 +3729,17 @@
             </w:tcMar>
           </w:tcPr>
           <w:p>
-            <w:r>
-              <w:rPr>
-                <w:b/>
-                <w:bCs/>
-                <w:color w:val="1A3A6B"/>
-              </w:rPr>
-              <w:t>Python</w:t>
-            </w:r>
+            <w:hyperlink r:id="rId34" w:history="1">
+              <w:r>
+                <w:rPr>
+                  <w:b/>
+                  <w:bCs/>
+                  <w:color w:val="1A3A6B"/>
+                  <w:u w:val="single"/>
+                </w:rPr>
+                <w:t>Python</w:t>
+              </w:r>
+            </w:hyperlink>
           </w:p>
         </w:tc>
         <w:tc>
@@ -3726,14 +3793,17 @@
             </w:tcMar>
           </w:tcPr>
           <w:p>
-            <w:r>
-              <w:rPr>
-                <w:b/>
-                <w:bCs/>
-                <w:color w:val="1A3A6B"/>
-              </w:rPr>
-              <w:t>Asyncio</w:t>
-            </w:r>
+            <w:hyperlink r:id="rId35" w:history="1">
+              <w:r>
+                <w:rPr>
+                  <w:b/>
+                  <w:bCs/>
+                  <w:color w:val="1A3A6B"/>
+                  <w:u w:val="single"/>
+                </w:rPr>
+                <w:t>Asyncio</w:t>
+              </w:r>
+            </w:hyperlink>
           </w:p>
         </w:tc>
         <w:tc>
@@ -3787,14 +3857,36 @@
             </w:tcMar>
           </w:tcPr>
           <w:p>
+            <w:hyperlink r:id="rId36" w:history="1">
+              <w:r>
+                <w:rPr>
+                  <w:b/>
+                  <w:bCs/>
+                  <w:color w:val="1A3A6B"/>
+                  <w:u w:val="single"/>
+                </w:rPr>
+                <w:t>WebSocket</w:t>
+              </w:r>
+            </w:hyperlink>
             <w:r>
               <w:rPr>
                 <w:b/>
                 <w:bCs/>
                 <w:color w:val="1A3A6B"/>
               </w:rPr>
-              <w:t>WebSocket + WebSockets (Python)</w:t>
+              <w:t xml:space="preserve"> + </w:t>
             </w:r>
+            <w:hyperlink r:id="rId37" w:history="1">
+              <w:r>
+                <w:rPr>
+                  <w:b/>
+                  <w:bCs/>
+                  <w:color w:val="1A3A6B"/>
+                  <w:u w:val="single"/>
+                </w:rPr>
+                <w:t>WebSockets (Python)</w:t>
+              </w:r>
+            </w:hyperlink>
           </w:p>
         </w:tc>
         <w:tc>
@@ -3854,14 +3946,17 @@
                 <w:color w:val="1A3A6B"/>
               </w:rPr>
             </w:pPr>
-            <w:r>
-              <w:rPr>
-                <w:b/>
-                <w:bCs/>
-                <w:color w:val="1A3A6B"/>
-              </w:rPr>
-              <w:t>Git</w:t>
-            </w:r>
+            <w:hyperlink r:id="rId38" w:history="1">
+              <w:r>
+                <w:rPr>
+                  <w:b/>
+                  <w:bCs/>
+                  <w:color w:val="1A3A6B"/>
+                  <w:u w:val="single"/>
+                </w:rPr>
+                <w:t>Git</w:t>
+              </w:r>
+            </w:hyperlink>
           </w:p>
         </w:tc>
         <w:tc>
@@ -3890,13 +3985,7 @@
               <w:rPr>
                 <w:color w:val="0D2459"/>
               </w:rPr>
-              <w:t xml:space="preserve">Controllo versione e </w:t>
-            </w:r>
-            <w:r>
-              <w:rPr>
-                <w:color w:val="0D2459"/>
-              </w:rPr>
-              <w:t>gestione sviluppo</w:t>
+              <w:t>Controllo versione e gestione sviluppo</w:t>
             </w:r>
           </w:p>
         </w:tc>
@@ -3964,31 +4053,7 @@
               <w:rPr>
                 <w:color w:val="0D2459"/>
               </w:rPr>
-              <w:t xml:space="preserve">Privacy, indipendenza </w:t>
-            </w:r>
-            <w:r>
-              <w:rPr>
-                <w:color w:val="0D2459"/>
-              </w:rPr>
-              <w:t xml:space="preserve">dal </w:t>
-            </w:r>
-            <w:r>
-              <w:rPr>
-                <w:color w:val="0D2459"/>
-              </w:rPr>
-              <w:t xml:space="preserve">cloud e </w:t>
-            </w:r>
-            <w:r>
-              <w:rPr>
-                <w:color w:val="0D2459"/>
-              </w:rPr>
-              <w:t>uso</w:t>
-            </w:r>
-            <w:r>
-              <w:rPr>
-                <w:color w:val="0D2459"/>
-              </w:rPr>
-              <w:t xml:space="preserve"> offline</w:t>
+              <w:t>Privacy, indipendenza dal cloud e uso offline</w:t>
             </w:r>
           </w:p>
         </w:tc>
@@ -4086,8 +4151,8 @@
       </w:pPr>
     </w:p>
     <w:sectPr>
-      <w:headerReference w:type="default" r:id="rId13"/>
-      <w:footerReference w:type="default" r:id="rId14"/>
+      <w:headerReference w:type="default" r:id="rId39"/>
+      <w:footerReference w:type="default" r:id="rId40"/>
       <w:pgSz w:w="11906" w:h="16838"/>
       <w:pgMar w:top="1440" w:right="1440" w:bottom="1440" w:left="1700" w:header="708" w:footer="708" w:gutter="0"/>
       <w:cols w:space="720"/>
@@ -4853,6 +4918,7 @@
   <w:style w:type="character" w:default="1" w:styleId="Carpredefinitoparagrafo">
     <w:name w:val="Default Paragraph Font"/>
     <w:uiPriority w:val="1"/>
+    <w:semiHidden/>
     <w:unhideWhenUsed/>
   </w:style>
   <w:style w:type="table" w:default="1" w:styleId="Tabellanormale">

</xml_diff>

<commit_message>
Minor fixing on the thesis
</commit_message>
<xml_diff>
--- a/documents/tesina.docx
+++ b/documents/tesina.docx
@@ -972,7 +972,21 @@
         <w:rPr>
           <w:color w:val="0D2459"/>
         </w:rPr>
-        <w:t xml:space="preserve">Bootstrap 5.3 è il framework CSS scelto per velocizzare lo sviluppo. Fornisce il sistema di griglia responsive, i componenti preconfezionati come le modali, i badge, le card e le navbar, oltre a una serie di classi di utilità per gestire margini, padding, display e colori. </w:t>
+        <w:t xml:space="preserve">Bootstrap 5.3 è il framework CSS scelto per velocizzare lo sviluppo. Fornisce il sistema di griglia responsive, i componenti preconfezionati come le modali, i </w:t>
+      </w:r>
+      <w:proofErr w:type="gramStart"/>
+      <w:r>
+        <w:rPr>
+          <w:color w:val="0D2459"/>
+        </w:rPr>
+        <w:t>badge</w:t>
+      </w:r>
+      <w:proofErr w:type="gramEnd"/>
+      <w:r>
+        <w:rPr>
+          <w:color w:val="0D2459"/>
+        </w:rPr>
+        <w:t xml:space="preserve">, le card e le navbar, oltre a una serie di classi di utilità per gestire margini, padding, display e colori. </w:t>
       </w:r>
       <w:r>
         <w:rPr>
@@ -1730,7 +1744,21 @@
         <w:rPr>
           <w:color w:val="0D2459"/>
         </w:rPr>
-        <w:t>La scheda del personaggio è la sezione centrale di DiceRoll e replica fedelmente le meccaniche di D&amp;D 5e. Le sei caratteristiche principali (Forza, Destrezza, Costituzione, Intelligenza, Saggezza, Carisma) sono la base di tutti i calcoli: il modificatore di ogni caratteristica viene calcolato automaticamente con la formula standard floor((valore - 10) / 2) e propagato a tutte le sezioni che ne dipendono — abilità, tiri salvezza, iniziativa, bonus agli attacchi con incantesimi.</w:t>
+        <w:t xml:space="preserve">La scheda del personaggio è la sezione centrale di DiceRoll e replica fedelmente le meccaniche di D&amp;D 5e. Le sei caratteristiche principali (Forza, Destrezza, Costituzione, Intelligenza, Saggezza, Carisma) sono la base di tutti i calcoli: il modificatore di ogni caratteristica viene calcolato automaticamente con la formula standard </w:t>
+      </w:r>
+      <w:proofErr w:type="gramStart"/>
+      <w:r>
+        <w:rPr>
+          <w:color w:val="0D2459"/>
+        </w:rPr>
+        <w:t>floor(</w:t>
+      </w:r>
+      <w:proofErr w:type="gramEnd"/>
+      <w:r>
+        <w:rPr>
+          <w:color w:val="0D2459"/>
+        </w:rPr>
+        <w:t>(valore - 10) / 2) e propagato a tutte le sezioni che ne dipendono — abilità, tiri salvezza, iniziativa, bonus agli attacchi con incantesimi.</w:t>
       </w:r>
     </w:p>
     <w:p>
@@ -2366,13 +2394,6 @@
                   <w:u w:val="single"/>
                 </w:rPr>
                 <w:t>H</w:t>
-              </w:r>
-              <w:r>
-                <w:rPr>
-                  <w:color w:val="0D2459"/>
-                  <w:u w:val="single"/>
-                </w:rPr>
-                <w:t>y</w:t>
               </w:r>
               <w:r>
                 <w:rPr>

</xml_diff>